<commit_message>
visual for training works
</commit_message>
<xml_diff>
--- a/Report_Outline.docx
+++ b/Report_Outline.docx
@@ -28,13 +28,8 @@
       <w:r>
         <w:t xml:space="preserve">70/30 split to train the model. Train/validation/test split will be done </w:t>
       </w:r>
-      <w:proofErr w:type="gramStart"/>
-      <w:r>
-        <w:t>later on</w:t>
-      </w:r>
-      <w:proofErr w:type="gramEnd"/>
-      <w:r>
-        <w:t xml:space="preserve"> </w:t>
+      <w:r>
+        <w:t xml:space="preserve">later on </w:t>
       </w:r>
       <w:r>
         <w:t>once N</w:t>
@@ -206,13 +201,8 @@
           <w:numId w:val="1"/>
         </w:numPr>
       </w:pPr>
-      <w:proofErr w:type="spellStart"/>
-      <w:r>
-        <w:t>Blacksurf</w:t>
-      </w:r>
-      <w:proofErr w:type="spellEnd"/>
-      <w:r>
-        <w:t>:</w:t>
+      <w:r>
+        <w:t>Blacksurf:</w:t>
       </w:r>
     </w:p>
     <w:p>
@@ -410,13 +400,7 @@
         <w:t>changing from floats to integers</w:t>
       </w:r>
       <w:r>
-        <w:t xml:space="preserve"> </w:t>
-      </w:r>
-      <w:r>
-        <w:t>(Khan et al. (2023)</w:t>
-      </w:r>
-      <w:r>
-        <w:t xml:space="preserve">. </w:t>
+        <w:t xml:space="preserve"> (Khan et al. (2023). </w:t>
       </w:r>
       <w:r>
         <w:t xml:space="preserve"> This means less epochs for the model, increasing its speed as well.</w:t>
@@ -449,39 +433,7 @@
           <w:b/>
           <w:bCs/>
         </w:rPr>
-        <w:t xml:space="preserve">Code for </w:t>
-      </w:r>
-      <w:proofErr w:type="spellStart"/>
-      <w:r>
-        <w:rPr>
-          <w:b/>
-          <w:bCs/>
-        </w:rPr>
-        <w:t>Tensorflow</w:t>
-      </w:r>
-      <w:proofErr w:type="spellEnd"/>
-      <w:r>
-        <w:rPr>
-          <w:b/>
-          <w:bCs/>
-        </w:rPr>
-        <w:t xml:space="preserve"> and </w:t>
-      </w:r>
-      <w:proofErr w:type="spellStart"/>
-      <w:r>
-        <w:rPr>
-          <w:b/>
-          <w:bCs/>
-        </w:rPr>
-        <w:t>Keras</w:t>
-      </w:r>
-      <w:proofErr w:type="spellEnd"/>
-      <w:r>
-        <w:rPr>
-          <w:b/>
-          <w:bCs/>
-        </w:rPr>
-        <w:t>:</w:t>
+        <w:t>Code for Tensorflow and Keras:</w:t>
       </w:r>
       <w:r>
         <w:rPr>
@@ -513,21 +465,8 @@
       </w:r>
     </w:p>
     <w:p>
-      <w:proofErr w:type="spellStart"/>
-      <w:r>
-        <w:t>Keras</w:t>
-      </w:r>
-      <w:proofErr w:type="spellEnd"/>
-      <w:r>
-        <w:t xml:space="preserve">, and by extension, </w:t>
-      </w:r>
-      <w:proofErr w:type="spellStart"/>
-      <w:r>
-        <w:t>tensorflow</w:t>
-      </w:r>
-      <w:proofErr w:type="spellEnd"/>
-      <w:r>
-        <w:t xml:space="preserve"> is used to create the CNN model.</w:t>
+      <w:r>
+        <w:t>Keras, and by extension, tensorflow is used to create the CNN model.</w:t>
       </w:r>
       <w:r>
         <w:t xml:space="preserve"> </w:t>
@@ -542,29 +481,13 @@
         <w:t xml:space="preserve">with 32 filters and a 3x3 kernel size. </w:t>
       </w:r>
       <w:r>
-        <w:t xml:space="preserve">Pooling. Activation </w:t>
-      </w:r>
-      <w:proofErr w:type="spellStart"/>
-      <w:r>
-        <w:t>ReLu</w:t>
-      </w:r>
-      <w:proofErr w:type="spellEnd"/>
-      <w:r>
-        <w:t xml:space="preserve"> for hidden layers. </w:t>
+        <w:t xml:space="preserve">Pooling. Activation ReLu for hidden layers. </w:t>
       </w:r>
       <w:r>
         <w:t xml:space="preserve">Compute </w:t>
       </w:r>
       <w:r>
-        <w:t>f(x) = max(</w:t>
-      </w:r>
-      <w:proofErr w:type="gramStart"/>
-      <w:r>
-        <w:t>0,x</w:t>
-      </w:r>
-      <w:proofErr w:type="gramEnd"/>
-      <w:r>
-        <w:t xml:space="preserve">), replace all negative pixel values with zero. </w:t>
+        <w:t xml:space="preserve">f(x) = max(0,x), replace all negative pixel values with zero. </w:t>
       </w:r>
       <w:r>
         <w:t xml:space="preserve">This allows the model network to learn non-linear patterns. It lets the model draw curvy boundaries between ‘Healthy’ and ‘Sick’. A 3x3 filter is placed over the images, the padding layer adds a border of zeros/empty pixels around the original image. It prevents the images from shrinking as it passes through the layers. </w:t>
@@ -597,6 +520,19 @@
       </w:r>
       <w:r>
         <w:t xml:space="preserve"> then classifying the potato leaf as healthy. </w:t>
+      </w:r>
+    </w:p>
+    <w:p>
+      <w:pPr>
+        <w:pStyle w:val="ListParagraph"/>
+        <w:numPr>
+          <w:ilvl w:val="0"/>
+          <w:numId w:val="1"/>
+        </w:numPr>
+      </w:pPr>
+      <w:r>
+        <w:lastRenderedPageBreak/>
+        <w:t xml:space="preserve">Add the math for ReLu layers and </w:t>
       </w:r>
     </w:p>
     <w:p>
@@ -611,8 +547,56 @@
           <w:b/>
           <w:bCs/>
         </w:rPr>
-        <w:lastRenderedPageBreak/>
         <w:t xml:space="preserve">Grayscale Code Branch: </w:t>
+      </w:r>
+    </w:p>
+    <w:p>
+      <w:pPr>
+        <w:rPr>
+          <w:b/>
+          <w:bCs/>
+        </w:rPr>
+      </w:pPr>
+    </w:p>
+    <w:p>
+      <w:pPr>
+        <w:rPr>
+          <w:b/>
+          <w:bCs/>
+        </w:rPr>
+      </w:pPr>
+      <w:r>
+        <w:rPr>
+          <w:b/>
+          <w:bCs/>
+        </w:rPr>
+        <w:t>Sobel Edge with Grad Cam:</w:t>
+      </w:r>
+    </w:p>
+    <w:p>
+      <w:r>
+        <w:t>Sobel Edge Detection: Filter that strips asway all color and texture leaving only structural boundaries (Veins, lesions, and holes).</w:t>
+      </w:r>
+    </w:p>
+    <w:p>
+      <w:r>
+        <w:t>Grad CAM: Creates heatmap to visualize which parts of an image a CNN model is focused on.</w:t>
+      </w:r>
+    </w:p>
+    <w:p>
+      <w:r>
+        <w:t>Is the model detecting the shape of the edges that the virus has created or is it just looking at a random shadow in the background.</w:t>
+      </w:r>
+    </w:p>
+    <w:p>
+      <w:r>
+        <w:t>Model uses the last convolution layer as the image has passed through all filters that recognized simple concepts like edges, corners and simple lines. Dense layer, model already has the answer of what disease it is, but it’s not looking at where the evidence is on the image.</w:t>
+      </w:r>
+    </w:p>
+    <w:p/>
+    <w:p>
+      <w:r>
+        <w:t>If I tweaked the pixels in the Feature Maps slightly, how much would the 'Early Blight' score change?</w:t>
       </w:r>
     </w:p>
     <w:sectPr>

</xml_diff>

<commit_message>
Fixed num class confusion and moved some field photos that got mixed in other folders.
</commit_message>
<xml_diff>
--- a/Report_Outline.docx
+++ b/Report_Outline.docx
@@ -14,48 +14,125 @@
           <w:b/>
           <w:bCs/>
         </w:rPr>
-        <w:t>Training/Validating Data:</w:t>
-      </w:r>
-      <w:r>
-        <w:rPr>
-          <w:b/>
-          <w:bCs/>
-        </w:rPr>
-        <w:br/>
-      </w:r>
-    </w:p>
-    <w:p>
-      <w:r>
-        <w:t xml:space="preserve">70/30 split to train the model. Train/validation/test split will be done </w:t>
-      </w:r>
-      <w:r>
-        <w:t xml:space="preserve">later on </w:t>
-      </w:r>
-      <w:r>
-        <w:t>once N</w:t>
-      </w:r>
-      <w:r>
-        <w:t>ASA</w:t>
-      </w:r>
-      <w:r>
-        <w:t xml:space="preserve"> weather API data is added. For now, the CNN model is being tested on whether it can see the difference between a healthy leaf and a sick one. All the data that has been acquired is publicly accessed. Limitations of sourcing, making sure the model is not cheating at the end</w:t>
-      </w:r>
-      <w:r>
-        <w:t xml:space="preserve"> after weather data is added to</w:t>
-      </w:r>
-      <w:r>
-        <w:t xml:space="preserve"> determine disease.</w:t>
-      </w:r>
-      <w:r>
+        <w:t>OUTLINE/ GENERAL OVERVIEW:</w:t>
+      </w:r>
+    </w:p>
+    <w:p>
+      <w:r>
+        <w:rPr>
+          <w:b/>
+          <w:bCs/>
+        </w:rPr>
+        <w:t xml:space="preserve">GOAL: </w:t>
+      </w:r>
+      <w:r>
+        <w:t xml:space="preserve">To create an explainable CNN model for potato disease detection that can overcome the limitations of lab photos. A dual branch feature fusion approach is implemented so that the model can analyze RGB/Grayscale and structural decay (Sobel Edges). This is to ensure the classification is based </w:t>
+      </w:r>
+      <w:r>
+        <w:t>off</w:t>
+      </w:r>
+      <w:r>
+        <w:t xml:space="preserve"> the potatoes biological structure of disease, such as lesions and leaf transformations, rather than environmental noise, lighting and low-quality sensor data.</w:t>
+      </w:r>
+    </w:p>
+    <w:p>
+      <w:r>
+        <w:rPr>
+          <w:b/>
+          <w:bCs/>
+        </w:rPr>
+        <w:t>RGB and Grayscale Branch:</w:t>
+      </w:r>
+      <w:r>
+        <w:rPr>
+          <w:b/>
+          <w:bCs/>
+        </w:rPr>
         <w:t xml:space="preserve"> </w:t>
       </w:r>
     </w:p>
     <w:p>
       <w:r>
-        <w:t>From the NASA weather API, variables we’re looking at are temperature, humidity and rain. The parameters from the API being used are</w:t>
-      </w:r>
-      <w:r>
-        <w:t>:</w:t>
+        <w:t xml:space="preserve">RGB: Identifies chromatic markers, such as yellowing of leaves in blight vs darker water-soaked spots of late blight. </w:t>
+      </w:r>
+    </w:p>
+    <w:p>
+      <w:r>
+        <w:t xml:space="preserve">Grayscale: Identifies disease based on the intensity and contrast of the pixels rather than just images. This is to deal with issues with lighting conditions in the real world </w:t>
+      </w:r>
+    </w:p>
+    <w:p>
+      <w:pPr>
+        <w:rPr>
+          <w:b/>
+          <w:bCs/>
+        </w:rPr>
+      </w:pPr>
+      <w:r>
+        <w:rPr>
+          <w:b/>
+          <w:bCs/>
+        </w:rPr>
+        <w:t xml:space="preserve">Sobel Edge Detection: </w:t>
+      </w:r>
+    </w:p>
+    <w:p>
+      <w:r>
+        <w:t xml:space="preserve">CNN models usually lose fine details during pooling, as it downsizes the pixels, the Sobel branch preserves this structural data. Trains the model to see the physical texture of the disease, such as jagged edges of lesions, fungal fuzz or more physical characteristic diseases like leaves curling of PLVR. </w:t>
+      </w:r>
+    </w:p>
+    <w:p>
+      <w:r>
+        <w:rPr>
+          <w:b/>
+          <w:bCs/>
+        </w:rPr>
+        <w:t>Grad-CAM</w:t>
+      </w:r>
+      <w:r>
+        <w:rPr>
+          <w:b/>
+          <w:bCs/>
+        </w:rPr>
+        <w:t xml:space="preserve">: </w:t>
+      </w:r>
+      <w:r>
+        <w:t xml:space="preserve">It creates a visual heatmap of the </w:t>
+      </w:r>
+      <w:r>
+        <w:t>model’s</w:t>
+      </w:r>
+      <w:r>
+        <w:t xml:space="preserve"> focus. </w:t>
+      </w:r>
+      <w:r>
+        <w:t xml:space="preserve">It’s a visualizer to ensure the model is looking at the potato to decide rather than background noise. </w:t>
+      </w:r>
+    </w:p>
+    <w:p>
+      <w:r>
+        <w:rPr>
+          <w:b/>
+          <w:bCs/>
+        </w:rPr>
+        <w:t xml:space="preserve">NASA Power API: </w:t>
+      </w:r>
+      <w:r>
+        <w:t xml:space="preserve">Diseases such as blight are living organisms with variables for how they grow, such as temperature and humidity levels. By using the NASA API to give the weather conditions, it gives the model real world variables to check up </w:t>
+      </w:r>
+      <w:r>
+        <w:t>against</w:t>
+      </w:r>
+      <w:r>
+        <w:t xml:space="preserve"> validation.</w:t>
+      </w:r>
+      <w:r>
+        <w:t xml:space="preserve"> </w:t>
+      </w:r>
+    </w:p>
+    <w:p>
+      <w:r>
+        <w:t>From the NASA weather API, variables we’re looking at are temperature, humidity and rain. The parameters from the API being used are:</w:t>
       </w:r>
     </w:p>
     <w:p>
@@ -91,227 +168,17 @@
         </w:numPr>
       </w:pPr>
       <w:r>
-        <w:t xml:space="preserve">PRECTOTCORR (Precipitation): Rainfall </w:t>
-      </w:r>
-      <w:r>
-        <w:t>amount</w:t>
-      </w:r>
-    </w:p>
-    <w:p>
-      <w:r>
-        <w:t xml:space="preserve">Calculating risks for each disease: </w:t>
-      </w:r>
-    </w:p>
-    <w:p>
-      <w:r>
-        <w:t xml:space="preserve">Leaf Cases: </w:t>
-      </w:r>
-    </w:p>
-    <w:p>
-      <w:pPr>
-        <w:pStyle w:val="ListParagraph"/>
-        <w:numPr>
-          <w:ilvl w:val="0"/>
-          <w:numId w:val="1"/>
-        </w:numPr>
-      </w:pPr>
-      <w:r>
-        <w:t>Late Blight: The Wallin Rules, Smith Periods (humidity and temp for infection risks)</w:t>
-      </w:r>
-    </w:p>
-    <w:p>
-      <w:pPr>
-        <w:pStyle w:val="ListParagraph"/>
-        <w:numPr>
-          <w:ilvl w:val="0"/>
-          <w:numId w:val="1"/>
-        </w:numPr>
-      </w:pPr>
-      <w:r>
-        <w:t xml:space="preserve">Early Blight: </w:t>
-      </w:r>
-      <w:r>
-        <w:t xml:space="preserve">Physiological Days (heat </w:t>
-      </w:r>
-      <w:r>
-        <w:t>plants have</w:t>
-      </w:r>
-      <w:r>
-        <w:t xml:space="preserve"> accumulated min/max daily temp)</w:t>
-      </w:r>
-    </w:p>
-    <w:p>
-      <w:pPr>
-        <w:pStyle w:val="ListParagraph"/>
-        <w:numPr>
-          <w:ilvl w:val="0"/>
-          <w:numId w:val="1"/>
-        </w:numPr>
-      </w:pPr>
-      <w:r>
-        <w:t xml:space="preserve">Mosaic Virus: </w:t>
-      </w:r>
-    </w:p>
-    <w:p>
-      <w:pPr>
-        <w:pStyle w:val="ListParagraph"/>
-        <w:numPr>
-          <w:ilvl w:val="0"/>
-          <w:numId w:val="1"/>
-        </w:numPr>
-      </w:pPr>
-      <w:r>
-        <w:t>PLVR Virus:</w:t>
-      </w:r>
-    </w:p>
-    <w:p>
-      <w:r>
-        <w:t xml:space="preserve">Tube Cases: </w:t>
-      </w:r>
-    </w:p>
-    <w:p>
-      <w:pPr>
-        <w:pStyle w:val="ListParagraph"/>
-        <w:numPr>
-          <w:ilvl w:val="0"/>
-          <w:numId w:val="1"/>
-        </w:numPr>
-      </w:pPr>
-      <w:r>
-        <w:t>Blackleg (Waterlogged Soil): Heavy rainfall, temp</w:t>
-      </w:r>
-    </w:p>
-    <w:p>
-      <w:pPr>
-        <w:pStyle w:val="ListParagraph"/>
-        <w:numPr>
-          <w:ilvl w:val="0"/>
-          <w:numId w:val="1"/>
-        </w:numPr>
-      </w:pPr>
-      <w:r>
-        <w:t>Blackspot bruising:</w:t>
-      </w:r>
-    </w:p>
-    <w:p>
-      <w:pPr>
-        <w:pStyle w:val="ListParagraph"/>
-        <w:numPr>
-          <w:ilvl w:val="0"/>
-          <w:numId w:val="1"/>
-        </w:numPr>
-      </w:pPr>
-      <w:r>
-        <w:t>Blacksurf:</w:t>
-      </w:r>
-    </w:p>
-    <w:p>
-      <w:pPr>
-        <w:pStyle w:val="ListParagraph"/>
-        <w:numPr>
-          <w:ilvl w:val="0"/>
-          <w:numId w:val="1"/>
-        </w:numPr>
-      </w:pPr>
-      <w:r>
-        <w:t>Brown Spot:</w:t>
-      </w:r>
-    </w:p>
-    <w:p>
-      <w:pPr>
-        <w:pStyle w:val="ListParagraph"/>
-        <w:numPr>
-          <w:ilvl w:val="0"/>
-          <w:numId w:val="1"/>
-        </w:numPr>
-      </w:pPr>
-      <w:r>
-        <w:t>Common Scab:</w:t>
-      </w:r>
-    </w:p>
-    <w:p>
-      <w:pPr>
-        <w:pStyle w:val="ListParagraph"/>
-        <w:numPr>
-          <w:ilvl w:val="0"/>
-          <w:numId w:val="1"/>
-        </w:numPr>
-      </w:pPr>
-      <w:r>
-        <w:t>Cracking Type:</w:t>
-      </w:r>
-    </w:p>
-    <w:p>
-      <w:pPr>
-        <w:pStyle w:val="ListParagraph"/>
-        <w:numPr>
-          <w:ilvl w:val="0"/>
-          <w:numId w:val="1"/>
-        </w:numPr>
-      </w:pPr>
-      <w:r>
-        <w:t>Dry Rot:</w:t>
-      </w:r>
-    </w:p>
-    <w:p>
-      <w:pPr>
-        <w:pStyle w:val="ListParagraph"/>
-        <w:numPr>
-          <w:ilvl w:val="0"/>
-          <w:numId w:val="1"/>
-        </w:numPr>
-      </w:pPr>
-      <w:r>
-        <w:t>Pink Rot:</w:t>
-      </w:r>
-    </w:p>
-    <w:p>
-      <w:pPr>
-        <w:pStyle w:val="ListParagraph"/>
-        <w:numPr>
-          <w:ilvl w:val="0"/>
-          <w:numId w:val="1"/>
-        </w:numPr>
-      </w:pPr>
-      <w:r>
-        <w:t>Pests (Aphids): Goldilocks Zone</w:t>
-      </w:r>
-      <w:r>
-        <w:t xml:space="preserve"> (Insects develop when it’s warm enough. Sum up degrees above base temp. and predict when eggs will hatch.)</w:t>
-      </w:r>
-    </w:p>
-    <w:p>
-      <w:pPr>
-        <w:pStyle w:val="ListParagraph"/>
-        <w:numPr>
-          <w:ilvl w:val="0"/>
-          <w:numId w:val="1"/>
-        </w:numPr>
-      </w:pPr>
-      <w:r>
-        <w:t>PSTVD:</w:t>
-      </w:r>
-    </w:p>
-    <w:p>
-      <w:pPr>
-        <w:pStyle w:val="ListParagraph"/>
-        <w:numPr>
-          <w:ilvl w:val="0"/>
-          <w:numId w:val="1"/>
-        </w:numPr>
-      </w:pPr>
-      <w:r>
-        <w:t>Soft Rot:</w:t>
-      </w:r>
-    </w:p>
-    <w:p>
-      <w:pPr>
-        <w:rPr>
-          <w:b/>
-          <w:bCs/>
-        </w:rPr>
-      </w:pPr>
-      <w:hyperlink r:id="rId5" w:history="1">
+        <w:t>PRECTOTCORR (Precipitation): Rainfall amount</w:t>
+      </w:r>
+    </w:p>
+    <w:p>
+      <w:pPr>
+        <w:rPr>
+          <w:b/>
+          <w:bCs/>
+        </w:rPr>
+      </w:pPr>
+      <w:hyperlink r:id="rId7" w:history="1">
         <w:r>
           <w:rPr>
             <w:rStyle w:val="Hyperlink"/>
@@ -323,18 +190,2052 @@
       </w:hyperlink>
     </w:p>
     <w:p>
-      <w:pPr>
-        <w:rPr>
-          <w:b/>
-          <w:bCs/>
-        </w:rPr>
-      </w:pPr>
+      <w:r>
+        <w:rPr>
+          <w:b/>
+          <w:bCs/>
+        </w:rPr>
+        <w:t>Viruses:</w:t>
+      </w:r>
+      <w:r>
+        <w:t xml:space="preserve"> Season (Temp/Wind)</w:t>
+      </w:r>
+    </w:p>
+    <w:p>
+      <w:r>
+        <w:rPr>
+          <w:b/>
+          <w:bCs/>
+        </w:rPr>
+        <w:t>Bacterial:</w:t>
+      </w:r>
+      <w:r>
+        <w:t xml:space="preserve"> Rainfall/Humidity </w:t>
+      </w:r>
+    </w:p>
+    <w:p>
+      <w:r>
+        <w:rPr>
+          <w:b/>
+          <w:bCs/>
+        </w:rPr>
+        <w:t>Fungal:</w:t>
+      </w:r>
+      <w:r>
+        <w:t xml:space="preserve"> Temp/Wetness</w:t>
+      </w:r>
+    </w:p>
+    <w:p>
       <w:r>
         <w:rPr>
           <w:b/>
           <w:bCs/>
         </w:rPr>
         <w:lastRenderedPageBreak/>
+        <w:t>Physical Defects:</w:t>
+      </w:r>
+      <w:r>
+        <w:t xml:space="preserve"> Soil Type /Moisture </w:t>
+      </w:r>
+    </w:p>
+    <w:p>
+      <w:pPr>
+        <w:rPr>
+          <w:b/>
+          <w:bCs/>
+        </w:rPr>
+      </w:pPr>
+      <w:r>
+        <w:rPr>
+          <w:b/>
+          <w:bCs/>
+        </w:rPr>
+        <w:t>Fig.</w:t>
+      </w:r>
+    </w:p>
+    <w:p>
+      <w:pPr>
+        <w:rPr>
+          <w:b/>
+          <w:bCs/>
+        </w:rPr>
+      </w:pPr>
+      <w:r>
+        <w:rPr>
+          <w:b/>
+          <w:bCs/>
+        </w:rPr>
+        <w:drawing>
+          <wp:inline distT="0" distB="0" distL="0" distR="0" wp14:anchorId="2A6F0223" wp14:editId="597E20FF">
+            <wp:extent cx="5943600" cy="2953385"/>
+            <wp:effectExtent l="0" t="0" r="0" b="0"/>
+            <wp:docPr id="149780348" name="Picture 1"/>
+            <wp:cNvGraphicFramePr>
+              <a:graphicFrameLocks xmlns:a="http://schemas.openxmlformats.org/drawingml/2006/main" noChangeAspect="1"/>
+            </wp:cNvGraphicFramePr>
+            <a:graphic xmlns:a="http://schemas.openxmlformats.org/drawingml/2006/main">
+              <a:graphicData uri="http://schemas.openxmlformats.org/drawingml/2006/picture">
+                <pic:pic xmlns:pic="http://schemas.openxmlformats.org/drawingml/2006/picture">
+                  <pic:nvPicPr>
+                    <pic:cNvPr id="149780348" name=""/>
+                    <pic:cNvPicPr/>
+                  </pic:nvPicPr>
+                  <pic:blipFill>
+                    <a:blip r:embed="rId8"/>
+                    <a:stretch>
+                      <a:fillRect/>
+                    </a:stretch>
+                  </pic:blipFill>
+                  <pic:spPr>
+                    <a:xfrm>
+                      <a:off x="0" y="0"/>
+                      <a:ext cx="5943600" cy="2953385"/>
+                    </a:xfrm>
+                    <a:prstGeom prst="rect">
+                      <a:avLst/>
+                    </a:prstGeom>
+                  </pic:spPr>
+                </pic:pic>
+              </a:graphicData>
+            </a:graphic>
+          </wp:inline>
+        </w:drawing>
+      </w:r>
+    </w:p>
+    <w:p>
+      <w:pPr>
+        <w:pStyle w:val="ListParagraph"/>
+        <w:numPr>
+          <w:ilvl w:val="0"/>
+          <w:numId w:val="1"/>
+        </w:numPr>
+        <w:rPr>
+          <w:b/>
+          <w:bCs/>
+        </w:rPr>
+      </w:pPr>
+      <w:r>
+        <w:rPr>
+          <w:b/>
+          <w:bCs/>
+        </w:rPr>
+        <w:t xml:space="preserve">Healthy Leaf: </w:t>
+      </w:r>
+    </w:p>
+    <w:p>
+      <w:pPr>
+        <w:pStyle w:val="ListParagraph"/>
+        <w:numPr>
+          <w:ilvl w:val="1"/>
+          <w:numId w:val="1"/>
+        </w:numPr>
+        <w:rPr>
+          <w:b/>
+          <w:bCs/>
+        </w:rPr>
+      </w:pPr>
+      <w:r>
+        <w:rPr>
+          <w:b/>
+          <w:bCs/>
+        </w:rPr>
+        <w:t>RGB/Grayscale</w:t>
+      </w:r>
+    </w:p>
+    <w:p>
+      <w:pPr>
+        <w:pStyle w:val="ListParagraph"/>
+        <w:numPr>
+          <w:ilvl w:val="1"/>
+          <w:numId w:val="1"/>
+        </w:numPr>
+        <w:rPr>
+          <w:b/>
+          <w:bCs/>
+        </w:rPr>
+      </w:pPr>
+      <w:r>
+        <w:rPr>
+          <w:b/>
+          <w:bCs/>
+        </w:rPr>
+        <w:t>Sobel Edge:</w:t>
+      </w:r>
+    </w:p>
+    <w:p>
+      <w:pPr>
+        <w:pStyle w:val="ListParagraph"/>
+        <w:numPr>
+          <w:ilvl w:val="1"/>
+          <w:numId w:val="1"/>
+        </w:numPr>
+        <w:rPr>
+          <w:b/>
+          <w:bCs/>
+        </w:rPr>
+      </w:pPr>
+      <w:r>
+        <w:rPr>
+          <w:b/>
+          <w:bCs/>
+        </w:rPr>
+        <w:t>Grad-CAM:</w:t>
+      </w:r>
+    </w:p>
+    <w:p>
+      <w:pPr>
+        <w:rPr>
+          <w:b/>
+          <w:bCs/>
+        </w:rPr>
+      </w:pPr>
+      <w:r>
+        <w:rPr>
+          <w:b/>
+          <w:bCs/>
+        </w:rPr>
+        <w:t xml:space="preserve">Disease in Leaves: </w:t>
+      </w:r>
+    </w:p>
+    <w:p>
+      <w:pPr>
+        <w:rPr>
+          <w:b/>
+          <w:bCs/>
+        </w:rPr>
+      </w:pPr>
+      <w:r>
+        <w:rPr>
+          <w:b/>
+          <w:bCs/>
+        </w:rPr>
+        <w:t>Fig.</w:t>
+      </w:r>
+    </w:p>
+    <w:p>
+      <w:pPr>
+        <w:rPr>
+          <w:b/>
+          <w:bCs/>
+        </w:rPr>
+      </w:pPr>
+      <w:r>
+        <w:rPr>
+          <w:b/>
+          <w:bCs/>
+        </w:rPr>
+        <w:lastRenderedPageBreak/>
+        <w:drawing>
+          <wp:inline distT="0" distB="0" distL="0" distR="0" wp14:anchorId="04351B90" wp14:editId="563B182B">
+            <wp:extent cx="5943600" cy="3097530"/>
+            <wp:effectExtent l="0" t="0" r="0" b="7620"/>
+            <wp:docPr id="1443186542" name="Picture 1"/>
+            <wp:cNvGraphicFramePr>
+              <a:graphicFrameLocks xmlns:a="http://schemas.openxmlformats.org/drawingml/2006/main" noChangeAspect="1"/>
+            </wp:cNvGraphicFramePr>
+            <a:graphic xmlns:a="http://schemas.openxmlformats.org/drawingml/2006/main">
+              <a:graphicData uri="http://schemas.openxmlformats.org/drawingml/2006/picture">
+                <pic:pic xmlns:pic="http://schemas.openxmlformats.org/drawingml/2006/picture">
+                  <pic:nvPicPr>
+                    <pic:cNvPr id="1443186542" name=""/>
+                    <pic:cNvPicPr/>
+                  </pic:nvPicPr>
+                  <pic:blipFill>
+                    <a:blip r:embed="rId9"/>
+                    <a:stretch>
+                      <a:fillRect/>
+                    </a:stretch>
+                  </pic:blipFill>
+                  <pic:spPr>
+                    <a:xfrm>
+                      <a:off x="0" y="0"/>
+                      <a:ext cx="5943600" cy="3097530"/>
+                    </a:xfrm>
+                    <a:prstGeom prst="rect">
+                      <a:avLst/>
+                    </a:prstGeom>
+                  </pic:spPr>
+                </pic:pic>
+              </a:graphicData>
+            </a:graphic>
+          </wp:inline>
+        </w:drawing>
+      </w:r>
+    </w:p>
+    <w:p>
+      <w:pPr>
+        <w:pStyle w:val="ListParagraph"/>
+        <w:numPr>
+          <w:ilvl w:val="0"/>
+          <w:numId w:val="3"/>
+        </w:numPr>
+        <w:rPr>
+          <w:b/>
+          <w:bCs/>
+        </w:rPr>
+      </w:pPr>
+      <w:r>
+        <w:rPr>
+          <w:b/>
+          <w:bCs/>
+        </w:rPr>
+        <w:t xml:space="preserve">Mosaic Virus: </w:t>
+      </w:r>
+    </w:p>
+    <w:p>
+      <w:pPr>
+        <w:pStyle w:val="ListParagraph"/>
+        <w:numPr>
+          <w:ilvl w:val="1"/>
+          <w:numId w:val="3"/>
+        </w:numPr>
+        <w:rPr>
+          <w:b/>
+          <w:bCs/>
+        </w:rPr>
+      </w:pPr>
+      <w:r>
+        <w:rPr>
+          <w:b/>
+          <w:bCs/>
+        </w:rPr>
+        <w:t>RGB/Grayscale:</w:t>
+      </w:r>
+      <w:r>
+        <w:t xml:space="preserve"> </w:t>
+      </w:r>
+    </w:p>
+    <w:p>
+      <w:pPr>
+        <w:pStyle w:val="ListParagraph"/>
+        <w:numPr>
+          <w:ilvl w:val="1"/>
+          <w:numId w:val="3"/>
+        </w:numPr>
+        <w:rPr>
+          <w:b/>
+          <w:bCs/>
+        </w:rPr>
+      </w:pPr>
+      <w:r>
+        <w:rPr>
+          <w:b/>
+          <w:bCs/>
+        </w:rPr>
+        <w:t>Sobel Edge:</w:t>
+      </w:r>
+    </w:p>
+    <w:p>
+      <w:pPr>
+        <w:pStyle w:val="ListParagraph"/>
+        <w:numPr>
+          <w:ilvl w:val="1"/>
+          <w:numId w:val="3"/>
+        </w:numPr>
+        <w:rPr>
+          <w:b/>
+          <w:bCs/>
+        </w:rPr>
+      </w:pPr>
+      <w:r>
+        <w:rPr>
+          <w:b/>
+          <w:bCs/>
+        </w:rPr>
+        <w:t>G</w:t>
+      </w:r>
+      <w:r>
+        <w:rPr>
+          <w:b/>
+          <w:bCs/>
+        </w:rPr>
+        <w:t>rad</w:t>
+      </w:r>
+      <w:r>
+        <w:rPr>
+          <w:b/>
+          <w:bCs/>
+        </w:rPr>
+        <w:t>-CAM:</w:t>
+      </w:r>
+      <w:r>
+        <w:t xml:space="preserve"> </w:t>
+      </w:r>
+    </w:p>
+    <w:p>
+      <w:pPr>
+        <w:rPr>
+          <w:b/>
+          <w:bCs/>
+        </w:rPr>
+      </w:pPr>
+      <w:r>
+        <w:rPr>
+          <w:b/>
+          <w:bCs/>
+        </w:rPr>
+        <w:t>Fig.</w:t>
+      </w:r>
+    </w:p>
+    <w:p>
+      <w:pPr>
+        <w:rPr>
+          <w:b/>
+          <w:bCs/>
+        </w:rPr>
+      </w:pPr>
+      <w:r>
+        <w:rPr>
+          <w:b/>
+          <w:bCs/>
+        </w:rPr>
+        <w:drawing>
+          <wp:inline distT="0" distB="0" distL="0" distR="0" wp14:anchorId="76702E34" wp14:editId="14446EEC">
+            <wp:extent cx="5943600" cy="2955290"/>
+            <wp:effectExtent l="0" t="0" r="0" b="0"/>
+            <wp:docPr id="2017549999" name="Picture 1"/>
+            <wp:cNvGraphicFramePr>
+              <a:graphicFrameLocks xmlns:a="http://schemas.openxmlformats.org/drawingml/2006/main" noChangeAspect="1"/>
+            </wp:cNvGraphicFramePr>
+            <a:graphic xmlns:a="http://schemas.openxmlformats.org/drawingml/2006/main">
+              <a:graphicData uri="http://schemas.openxmlformats.org/drawingml/2006/picture">
+                <pic:pic xmlns:pic="http://schemas.openxmlformats.org/drawingml/2006/picture">
+                  <pic:nvPicPr>
+                    <pic:cNvPr id="2017549999" name=""/>
+                    <pic:cNvPicPr/>
+                  </pic:nvPicPr>
+                  <pic:blipFill>
+                    <a:blip r:embed="rId10"/>
+                    <a:stretch>
+                      <a:fillRect/>
+                    </a:stretch>
+                  </pic:blipFill>
+                  <pic:spPr>
+                    <a:xfrm>
+                      <a:off x="0" y="0"/>
+                      <a:ext cx="5943600" cy="2955290"/>
+                    </a:xfrm>
+                    <a:prstGeom prst="rect">
+                      <a:avLst/>
+                    </a:prstGeom>
+                  </pic:spPr>
+                </pic:pic>
+              </a:graphicData>
+            </a:graphic>
+          </wp:inline>
+        </w:drawing>
+      </w:r>
+    </w:p>
+    <w:p>
+      <w:pPr>
+        <w:pStyle w:val="ListParagraph"/>
+        <w:numPr>
+          <w:ilvl w:val="0"/>
+          <w:numId w:val="3"/>
+        </w:numPr>
+        <w:rPr>
+          <w:b/>
+          <w:bCs/>
+        </w:rPr>
+      </w:pPr>
+      <w:r>
+        <w:rPr>
+          <w:b/>
+          <w:bCs/>
+        </w:rPr>
+        <w:t>PLVR</w:t>
+      </w:r>
+      <w:r>
+        <w:rPr>
+          <w:b/>
+          <w:bCs/>
+        </w:rPr>
+        <w:t xml:space="preserve"> Virus: </w:t>
+      </w:r>
+    </w:p>
+    <w:p>
+      <w:pPr>
+        <w:pStyle w:val="ListParagraph"/>
+        <w:numPr>
+          <w:ilvl w:val="1"/>
+          <w:numId w:val="3"/>
+        </w:numPr>
+        <w:rPr>
+          <w:b/>
+          <w:bCs/>
+        </w:rPr>
+      </w:pPr>
+      <w:r>
+        <w:rPr>
+          <w:b/>
+          <w:bCs/>
+        </w:rPr>
+        <w:t>RGB/Grayscale:</w:t>
+      </w:r>
+      <w:r>
+        <w:t xml:space="preserve"> </w:t>
+      </w:r>
+    </w:p>
+    <w:p>
+      <w:pPr>
+        <w:pStyle w:val="ListParagraph"/>
+        <w:numPr>
+          <w:ilvl w:val="1"/>
+          <w:numId w:val="3"/>
+        </w:numPr>
+        <w:rPr>
+          <w:b/>
+          <w:bCs/>
+        </w:rPr>
+      </w:pPr>
+      <w:r>
+        <w:rPr>
+          <w:b/>
+          <w:bCs/>
+        </w:rPr>
+        <w:lastRenderedPageBreak/>
+        <w:t>Sobel Edge:</w:t>
+      </w:r>
+    </w:p>
+    <w:p>
+      <w:pPr>
+        <w:pStyle w:val="ListParagraph"/>
+        <w:numPr>
+          <w:ilvl w:val="1"/>
+          <w:numId w:val="3"/>
+        </w:numPr>
+        <w:rPr>
+          <w:b/>
+          <w:bCs/>
+        </w:rPr>
+      </w:pPr>
+      <w:r>
+        <w:rPr>
+          <w:b/>
+          <w:bCs/>
+        </w:rPr>
+        <w:t>G</w:t>
+      </w:r>
+      <w:r>
+        <w:rPr>
+          <w:b/>
+          <w:bCs/>
+        </w:rPr>
+        <w:t>rad</w:t>
+      </w:r>
+      <w:r>
+        <w:rPr>
+          <w:b/>
+          <w:bCs/>
+        </w:rPr>
+        <w:t>-</w:t>
+      </w:r>
+      <w:r>
+        <w:rPr>
+          <w:b/>
+          <w:bCs/>
+        </w:rPr>
+        <w:t>CAM:</w:t>
+      </w:r>
+      <w:r>
+        <w:t xml:space="preserve"> </w:t>
+      </w:r>
+    </w:p>
+    <w:p>
+      <w:pPr>
+        <w:rPr>
+          <w:b/>
+          <w:bCs/>
+        </w:rPr>
+      </w:pPr>
+      <w:r>
+        <w:rPr>
+          <w:b/>
+          <w:bCs/>
+        </w:rPr>
+        <w:t xml:space="preserve">Fig. </w:t>
+      </w:r>
+    </w:p>
+    <w:p>
+      <w:pPr>
+        <w:pStyle w:val="ListParagraph"/>
+        <w:numPr>
+          <w:ilvl w:val="0"/>
+          <w:numId w:val="3"/>
+        </w:numPr>
+        <w:rPr>
+          <w:b/>
+          <w:bCs/>
+        </w:rPr>
+      </w:pPr>
+      <w:r>
+        <w:drawing>
+          <wp:anchor distT="0" distB="0" distL="114300" distR="114300" simplePos="0" relativeHeight="251659264" behindDoc="0" locked="0" layoutInCell="1" allowOverlap="1" wp14:anchorId="1DAF920C" wp14:editId="69D853FB">
+            <wp:simplePos x="0" y="0"/>
+            <wp:positionH relativeFrom="column">
+              <wp:posOffset>0</wp:posOffset>
+            </wp:positionH>
+            <wp:positionV relativeFrom="paragraph">
+              <wp:posOffset>-2457</wp:posOffset>
+            </wp:positionV>
+            <wp:extent cx="5943600" cy="3102610"/>
+            <wp:effectExtent l="0" t="0" r="0" b="2540"/>
+            <wp:wrapTopAndBottom/>
+            <wp:docPr id="2089246208" name="Picture 1"/>
+            <wp:cNvGraphicFramePr>
+              <a:graphicFrameLocks xmlns:a="http://schemas.openxmlformats.org/drawingml/2006/main" noChangeAspect="1"/>
+            </wp:cNvGraphicFramePr>
+            <a:graphic xmlns:a="http://schemas.openxmlformats.org/drawingml/2006/main">
+              <a:graphicData uri="http://schemas.openxmlformats.org/drawingml/2006/picture">
+                <pic:pic xmlns:pic="http://schemas.openxmlformats.org/drawingml/2006/picture">
+                  <pic:nvPicPr>
+                    <pic:cNvPr id="2089246208" name=""/>
+                    <pic:cNvPicPr/>
+                  </pic:nvPicPr>
+                  <pic:blipFill>
+                    <a:blip r:embed="rId11" cstate="print">
+                      <a:extLst>
+                        <a:ext uri="{28A0092B-C50C-407E-A947-70E740481C1C}">
+                          <a14:useLocalDpi xmlns:a14="http://schemas.microsoft.com/office/drawing/2010/main" val="0"/>
+                        </a:ext>
+                      </a:extLst>
+                    </a:blip>
+                    <a:stretch>
+                      <a:fillRect/>
+                    </a:stretch>
+                  </pic:blipFill>
+                  <pic:spPr>
+                    <a:xfrm>
+                      <a:off x="0" y="0"/>
+                      <a:ext cx="5943600" cy="3102610"/>
+                    </a:xfrm>
+                    <a:prstGeom prst="rect">
+                      <a:avLst/>
+                    </a:prstGeom>
+                  </pic:spPr>
+                </pic:pic>
+              </a:graphicData>
+            </a:graphic>
+          </wp:anchor>
+        </w:drawing>
+      </w:r>
+      <w:r>
+        <w:rPr>
+          <w:b/>
+          <w:bCs/>
+        </w:rPr>
+        <w:t xml:space="preserve"> </w:t>
+      </w:r>
+      <w:r>
+        <w:rPr>
+          <w:b/>
+          <w:bCs/>
+        </w:rPr>
+        <w:t>Early Blight:</w:t>
+      </w:r>
+    </w:p>
+    <w:p>
+      <w:pPr>
+        <w:pStyle w:val="ListParagraph"/>
+        <w:numPr>
+          <w:ilvl w:val="1"/>
+          <w:numId w:val="3"/>
+        </w:numPr>
+        <w:rPr>
+          <w:b/>
+          <w:bCs/>
+        </w:rPr>
+      </w:pPr>
+      <w:r>
+        <w:rPr>
+          <w:b/>
+          <w:bCs/>
+        </w:rPr>
+        <w:t xml:space="preserve">RGB/Grayscale: </w:t>
+      </w:r>
+      <w:r>
+        <w:t>Patches of brown spots on leaves. White specks are clearer on grayscale.</w:t>
+      </w:r>
+    </w:p>
+    <w:p>
+      <w:pPr>
+        <w:pStyle w:val="ListParagraph"/>
+        <w:numPr>
+          <w:ilvl w:val="1"/>
+          <w:numId w:val="3"/>
+        </w:numPr>
+        <w:rPr>
+          <w:b/>
+          <w:bCs/>
+        </w:rPr>
+      </w:pPr>
+      <w:r>
+        <w:rPr>
+          <w:b/>
+          <w:bCs/>
+        </w:rPr>
+        <w:t>Sobel Edge:</w:t>
+      </w:r>
+    </w:p>
+    <w:p>
+      <w:pPr>
+        <w:pStyle w:val="ListParagraph"/>
+        <w:numPr>
+          <w:ilvl w:val="1"/>
+          <w:numId w:val="3"/>
+        </w:numPr>
+        <w:rPr>
+          <w:b/>
+          <w:bCs/>
+        </w:rPr>
+      </w:pPr>
+      <w:r>
+        <w:rPr>
+          <w:b/>
+          <w:bCs/>
+        </w:rPr>
+        <w:t>Grad-CAM:</w:t>
+      </w:r>
+    </w:p>
+    <w:p>
+      <w:pPr>
+        <w:rPr>
+          <w:b/>
+          <w:bCs/>
+        </w:rPr>
+      </w:pPr>
+      <w:r>
+        <w:rPr>
+          <w:b/>
+          <w:bCs/>
+        </w:rPr>
+        <w:drawing>
+          <wp:inline distT="0" distB="0" distL="0" distR="0" wp14:anchorId="28624B9A" wp14:editId="5419B116">
+            <wp:extent cx="5943600" cy="3011805"/>
+            <wp:effectExtent l="0" t="0" r="0" b="0"/>
+            <wp:docPr id="308586568" name="Picture 1"/>
+            <wp:cNvGraphicFramePr>
+              <a:graphicFrameLocks xmlns:a="http://schemas.openxmlformats.org/drawingml/2006/main" noChangeAspect="1"/>
+            </wp:cNvGraphicFramePr>
+            <a:graphic xmlns:a="http://schemas.openxmlformats.org/drawingml/2006/main">
+              <a:graphicData uri="http://schemas.openxmlformats.org/drawingml/2006/picture">
+                <pic:pic xmlns:pic="http://schemas.openxmlformats.org/drawingml/2006/picture">
+                  <pic:nvPicPr>
+                    <pic:cNvPr id="308586568" name=""/>
+                    <pic:cNvPicPr/>
+                  </pic:nvPicPr>
+                  <pic:blipFill>
+                    <a:blip r:embed="rId12"/>
+                    <a:stretch>
+                      <a:fillRect/>
+                    </a:stretch>
+                  </pic:blipFill>
+                  <pic:spPr>
+                    <a:xfrm>
+                      <a:off x="0" y="0"/>
+                      <a:ext cx="5943600" cy="3011805"/>
+                    </a:xfrm>
+                    <a:prstGeom prst="rect">
+                      <a:avLst/>
+                    </a:prstGeom>
+                  </pic:spPr>
+                </pic:pic>
+              </a:graphicData>
+            </a:graphic>
+          </wp:inline>
+        </w:drawing>
+      </w:r>
+    </w:p>
+    <w:p>
+      <w:pPr>
+        <w:rPr>
+          <w:b/>
+          <w:bCs/>
+        </w:rPr>
+      </w:pPr>
+    </w:p>
+    <w:p>
+      <w:pPr>
+        <w:pStyle w:val="ListParagraph"/>
+        <w:numPr>
+          <w:ilvl w:val="0"/>
+          <w:numId w:val="3"/>
+        </w:numPr>
+        <w:rPr>
+          <w:b/>
+          <w:bCs/>
+        </w:rPr>
+      </w:pPr>
+      <w:r>
+        <w:rPr>
+          <w:b/>
+          <w:bCs/>
+        </w:rPr>
+        <w:t xml:space="preserve">Late Blight: </w:t>
+      </w:r>
+    </w:p>
+    <w:p>
+      <w:pPr>
+        <w:pStyle w:val="ListParagraph"/>
+        <w:numPr>
+          <w:ilvl w:val="1"/>
+          <w:numId w:val="3"/>
+        </w:numPr>
+        <w:rPr>
+          <w:b/>
+          <w:bCs/>
+        </w:rPr>
+      </w:pPr>
+      <w:r>
+        <w:rPr>
+          <w:b/>
+          <w:bCs/>
+        </w:rPr>
+        <w:t>RGB/Grayscale</w:t>
+      </w:r>
+    </w:p>
+    <w:p>
+      <w:pPr>
+        <w:pStyle w:val="ListParagraph"/>
+        <w:numPr>
+          <w:ilvl w:val="1"/>
+          <w:numId w:val="3"/>
+        </w:numPr>
+        <w:rPr>
+          <w:b/>
+          <w:bCs/>
+        </w:rPr>
+      </w:pPr>
+      <w:r>
+        <w:rPr>
+          <w:b/>
+          <w:bCs/>
+        </w:rPr>
+        <w:t>Sobel Edge:</w:t>
+      </w:r>
+    </w:p>
+    <w:p>
+      <w:pPr>
+        <w:pStyle w:val="ListParagraph"/>
+        <w:numPr>
+          <w:ilvl w:val="1"/>
+          <w:numId w:val="3"/>
+        </w:numPr>
+        <w:rPr>
+          <w:b/>
+          <w:bCs/>
+        </w:rPr>
+      </w:pPr>
+      <w:r>
+        <w:rPr>
+          <w:b/>
+          <w:bCs/>
+        </w:rPr>
+        <w:t>Grad-CAM</w:t>
+      </w:r>
+    </w:p>
+    <w:p>
+      <w:pPr>
+        <w:rPr>
+          <w:b/>
+          <w:bCs/>
+        </w:rPr>
+      </w:pPr>
+      <w:r>
+        <w:rPr>
+          <w:b/>
+          <w:bCs/>
+        </w:rPr>
+        <w:t xml:space="preserve">Fig. </w:t>
+      </w:r>
+    </w:p>
+    <w:p>
+      <w:pPr>
+        <w:pStyle w:val="ListParagraph"/>
+      </w:pPr>
+      <w:r>
+        <w:drawing>
+          <wp:inline distT="0" distB="0" distL="0" distR="0" wp14:anchorId="17CC4A78" wp14:editId="5401242B">
+            <wp:extent cx="5943600" cy="3165475"/>
+            <wp:effectExtent l="0" t="0" r="0" b="0"/>
+            <wp:docPr id="1524739597" name="Picture 1"/>
+            <wp:cNvGraphicFramePr>
+              <a:graphicFrameLocks xmlns:a="http://schemas.openxmlformats.org/drawingml/2006/main" noChangeAspect="1"/>
+            </wp:cNvGraphicFramePr>
+            <a:graphic xmlns:a="http://schemas.openxmlformats.org/drawingml/2006/main">
+              <a:graphicData uri="http://schemas.openxmlformats.org/drawingml/2006/picture">
+                <pic:pic xmlns:pic="http://schemas.openxmlformats.org/drawingml/2006/picture">
+                  <pic:nvPicPr>
+                    <pic:cNvPr id="1524739597" name=""/>
+                    <pic:cNvPicPr/>
+                  </pic:nvPicPr>
+                  <pic:blipFill>
+                    <a:blip r:embed="rId13"/>
+                    <a:stretch>
+                      <a:fillRect/>
+                    </a:stretch>
+                  </pic:blipFill>
+                  <pic:spPr>
+                    <a:xfrm>
+                      <a:off x="0" y="0"/>
+                      <a:ext cx="5943600" cy="3165475"/>
+                    </a:xfrm>
+                    <a:prstGeom prst="rect">
+                      <a:avLst/>
+                    </a:prstGeom>
+                  </pic:spPr>
+                </pic:pic>
+              </a:graphicData>
+            </a:graphic>
+          </wp:inline>
+        </w:drawing>
+      </w:r>
+    </w:p>
+    <w:p>
+      <w:pPr>
+        <w:pStyle w:val="ListParagraph"/>
+        <w:numPr>
+          <w:ilvl w:val="0"/>
+          <w:numId w:val="3"/>
+        </w:numPr>
+      </w:pPr>
+      <w:r>
+        <w:rPr>
+          <w:b/>
+          <w:bCs/>
+        </w:rPr>
+        <w:t xml:space="preserve">General Bacteria: </w:t>
+      </w:r>
+    </w:p>
+    <w:p>
+      <w:pPr>
+        <w:pStyle w:val="ListParagraph"/>
+        <w:numPr>
+          <w:ilvl w:val="1"/>
+          <w:numId w:val="3"/>
+        </w:numPr>
+      </w:pPr>
+      <w:r>
+        <w:rPr>
+          <w:b/>
+          <w:bCs/>
+        </w:rPr>
+        <w:t>RGB/Grayscale</w:t>
+      </w:r>
+    </w:p>
+    <w:p>
+      <w:pPr>
+        <w:pStyle w:val="ListParagraph"/>
+        <w:numPr>
+          <w:ilvl w:val="1"/>
+          <w:numId w:val="3"/>
+        </w:numPr>
+      </w:pPr>
+      <w:r>
+        <w:rPr>
+          <w:b/>
+          <w:bCs/>
+        </w:rPr>
+        <w:t>Sobel Edge</w:t>
+      </w:r>
+    </w:p>
+    <w:p>
+      <w:pPr>
+        <w:pStyle w:val="ListParagraph"/>
+        <w:numPr>
+          <w:ilvl w:val="1"/>
+          <w:numId w:val="3"/>
+        </w:numPr>
+      </w:pPr>
+      <w:r>
+        <w:rPr>
+          <w:b/>
+          <w:bCs/>
+        </w:rPr>
+        <w:t xml:space="preserve">Grad–CAM </w:t>
+      </w:r>
+    </w:p>
+    <w:p>
+      <w:pPr>
+        <w:pStyle w:val="ListParagraph"/>
+      </w:pPr>
+    </w:p>
+    <w:p>
+      <w:pPr>
+        <w:rPr>
+          <w:b/>
+          <w:bCs/>
+        </w:rPr>
+      </w:pPr>
+      <w:r>
+        <w:rPr>
+          <w:b/>
+          <w:bCs/>
+        </w:rPr>
+        <w:t xml:space="preserve">Tube and Soil Disease: </w:t>
+      </w:r>
+    </w:p>
+    <w:p>
+      <w:pPr>
+        <w:rPr>
+          <w:b/>
+          <w:bCs/>
+        </w:rPr>
+      </w:pPr>
+      <w:r>
+        <w:rPr>
+          <w:b/>
+          <w:bCs/>
+        </w:rPr>
+        <w:t xml:space="preserve">Fig. </w:t>
+      </w:r>
+    </w:p>
+    <w:p>
+      <w:pPr>
+        <w:rPr>
+          <w:b/>
+          <w:bCs/>
+        </w:rPr>
+      </w:pPr>
+      <w:r>
+        <w:rPr>
+          <w:b/>
+          <w:bCs/>
+        </w:rPr>
+        <w:lastRenderedPageBreak/>
+        <w:drawing>
+          <wp:inline distT="0" distB="0" distL="0" distR="0" wp14:anchorId="406BD19C" wp14:editId="34559D27">
+            <wp:extent cx="5943600" cy="3004820"/>
+            <wp:effectExtent l="0" t="0" r="0" b="5080"/>
+            <wp:docPr id="1003952754" name="Picture 1"/>
+            <wp:cNvGraphicFramePr>
+              <a:graphicFrameLocks xmlns:a="http://schemas.openxmlformats.org/drawingml/2006/main" noChangeAspect="1"/>
+            </wp:cNvGraphicFramePr>
+            <a:graphic xmlns:a="http://schemas.openxmlformats.org/drawingml/2006/main">
+              <a:graphicData uri="http://schemas.openxmlformats.org/drawingml/2006/picture">
+                <pic:pic xmlns:pic="http://schemas.openxmlformats.org/drawingml/2006/picture">
+                  <pic:nvPicPr>
+                    <pic:cNvPr id="1003952754" name=""/>
+                    <pic:cNvPicPr/>
+                  </pic:nvPicPr>
+                  <pic:blipFill>
+                    <a:blip r:embed="rId14"/>
+                    <a:stretch>
+                      <a:fillRect/>
+                    </a:stretch>
+                  </pic:blipFill>
+                  <pic:spPr>
+                    <a:xfrm>
+                      <a:off x="0" y="0"/>
+                      <a:ext cx="5943600" cy="3004820"/>
+                    </a:xfrm>
+                    <a:prstGeom prst="rect">
+                      <a:avLst/>
+                    </a:prstGeom>
+                  </pic:spPr>
+                </pic:pic>
+              </a:graphicData>
+            </a:graphic>
+          </wp:inline>
+        </w:drawing>
+      </w:r>
+    </w:p>
+    <w:p>
+      <w:pPr>
+        <w:pStyle w:val="ListParagraph"/>
+        <w:numPr>
+          <w:ilvl w:val="0"/>
+          <w:numId w:val="3"/>
+        </w:numPr>
+        <w:rPr>
+          <w:b/>
+          <w:bCs/>
+        </w:rPr>
+      </w:pPr>
+      <w:r>
+        <w:rPr>
+          <w:b/>
+          <w:bCs/>
+        </w:rPr>
+        <w:t>Healthy Potatoes:</w:t>
+      </w:r>
+    </w:p>
+    <w:p>
+      <w:pPr>
+        <w:pStyle w:val="ListParagraph"/>
+        <w:numPr>
+          <w:ilvl w:val="1"/>
+          <w:numId w:val="3"/>
+        </w:numPr>
+        <w:rPr>
+          <w:b/>
+          <w:bCs/>
+        </w:rPr>
+      </w:pPr>
+      <w:r>
+        <w:rPr>
+          <w:b/>
+          <w:bCs/>
+        </w:rPr>
+        <w:t>RGB/Grayscale:</w:t>
+      </w:r>
+    </w:p>
+    <w:p>
+      <w:pPr>
+        <w:pStyle w:val="ListParagraph"/>
+        <w:numPr>
+          <w:ilvl w:val="1"/>
+          <w:numId w:val="3"/>
+        </w:numPr>
+        <w:rPr>
+          <w:b/>
+          <w:bCs/>
+        </w:rPr>
+      </w:pPr>
+      <w:r>
+        <w:rPr>
+          <w:b/>
+          <w:bCs/>
+        </w:rPr>
+        <w:t>Sobel Edge:</w:t>
+      </w:r>
+    </w:p>
+    <w:p>
+      <w:pPr>
+        <w:pStyle w:val="ListParagraph"/>
+        <w:numPr>
+          <w:ilvl w:val="1"/>
+          <w:numId w:val="3"/>
+        </w:numPr>
+        <w:rPr>
+          <w:b/>
+          <w:bCs/>
+        </w:rPr>
+      </w:pPr>
+      <w:r>
+        <w:rPr>
+          <w:b/>
+          <w:bCs/>
+        </w:rPr>
+        <w:t>Grad-CAM:</w:t>
+      </w:r>
+    </w:p>
+    <w:p>
+      <w:pPr>
+        <w:pStyle w:val="ListParagraph"/>
+        <w:numPr>
+          <w:ilvl w:val="0"/>
+          <w:numId w:val="3"/>
+        </w:numPr>
+        <w:rPr>
+          <w:b/>
+          <w:bCs/>
+        </w:rPr>
+      </w:pPr>
+      <w:r>
+        <w:rPr>
+          <w:b/>
+          <w:bCs/>
+        </w:rPr>
+        <w:t>Blackleg and Soft Rot:</w:t>
+      </w:r>
+    </w:p>
+    <w:p>
+      <w:pPr>
+        <w:pStyle w:val="ListParagraph"/>
+        <w:numPr>
+          <w:ilvl w:val="1"/>
+          <w:numId w:val="3"/>
+        </w:numPr>
+        <w:rPr>
+          <w:b/>
+          <w:bCs/>
+        </w:rPr>
+      </w:pPr>
+      <w:r>
+        <w:rPr>
+          <w:b/>
+          <w:bCs/>
+        </w:rPr>
+        <w:t>RGB/Grayscale:</w:t>
+      </w:r>
+    </w:p>
+    <w:p>
+      <w:pPr>
+        <w:pStyle w:val="ListParagraph"/>
+        <w:numPr>
+          <w:ilvl w:val="1"/>
+          <w:numId w:val="3"/>
+        </w:numPr>
+        <w:rPr>
+          <w:b/>
+          <w:bCs/>
+        </w:rPr>
+      </w:pPr>
+      <w:r>
+        <w:rPr>
+          <w:b/>
+          <w:bCs/>
+        </w:rPr>
+        <w:t>Sobel:</w:t>
+      </w:r>
+      <w:r>
+        <w:rPr>
+          <w:b/>
+          <w:bCs/>
+        </w:rPr>
+        <w:t xml:space="preserve"> </w:t>
+      </w:r>
+      <w:r>
+        <w:t>Identify the collapse of the stem base or sunken cavities in the tuber.</w:t>
+      </w:r>
+    </w:p>
+    <w:p>
+      <w:pPr>
+        <w:pStyle w:val="ListParagraph"/>
+        <w:numPr>
+          <w:ilvl w:val="1"/>
+          <w:numId w:val="3"/>
+        </w:numPr>
+        <w:rPr>
+          <w:b/>
+          <w:bCs/>
+        </w:rPr>
+      </w:pPr>
+      <w:r>
+        <w:rPr>
+          <w:b/>
+          <w:bCs/>
+        </w:rPr>
+        <w:t>Grad-CAM:</w:t>
+      </w:r>
+    </w:p>
+    <w:p>
+      <w:pPr>
+        <w:pStyle w:val="ListParagraph"/>
+        <w:numPr>
+          <w:ilvl w:val="0"/>
+          <w:numId w:val="3"/>
+        </w:numPr>
+        <w:rPr>
+          <w:b/>
+          <w:bCs/>
+        </w:rPr>
+      </w:pPr>
+      <w:r>
+        <w:rPr>
+          <w:b/>
+          <w:bCs/>
+        </w:rPr>
+        <w:t>Common Scan and Dry Rot:</w:t>
+      </w:r>
+    </w:p>
+    <w:p>
+      <w:pPr>
+        <w:pStyle w:val="ListParagraph"/>
+        <w:numPr>
+          <w:ilvl w:val="1"/>
+          <w:numId w:val="3"/>
+        </w:numPr>
+        <w:rPr>
+          <w:b/>
+          <w:bCs/>
+        </w:rPr>
+      </w:pPr>
+      <w:r>
+        <w:rPr>
+          <w:b/>
+          <w:bCs/>
+        </w:rPr>
+        <w:t>RGB</w:t>
+      </w:r>
+      <w:r>
+        <w:rPr>
+          <w:b/>
+          <w:bCs/>
+        </w:rPr>
+        <w:t>/Grayscale</w:t>
+      </w:r>
+      <w:r>
+        <w:rPr>
+          <w:b/>
+          <w:bCs/>
+        </w:rPr>
+        <w:t xml:space="preserve">: </w:t>
+      </w:r>
+      <w:r>
+        <w:t>Scabs a tan/brown warts. With dry rot often showing internal darkening and white/pink fungal fuzz.</w:t>
+      </w:r>
+    </w:p>
+    <w:p>
+      <w:pPr>
+        <w:pStyle w:val="ListParagraph"/>
+        <w:numPr>
+          <w:ilvl w:val="1"/>
+          <w:numId w:val="3"/>
+        </w:numPr>
+        <w:rPr>
+          <w:b/>
+          <w:bCs/>
+        </w:rPr>
+      </w:pPr>
+      <w:r>
+        <w:rPr>
+          <w:b/>
+          <w:bCs/>
+        </w:rPr>
+        <w:t>Sobe</w:t>
+      </w:r>
+      <w:r>
+        <w:rPr>
+          <w:b/>
+          <w:bCs/>
+        </w:rPr>
+        <w:t>l</w:t>
+      </w:r>
+      <w:r>
+        <w:rPr>
+          <w:b/>
+          <w:bCs/>
+        </w:rPr>
+        <w:t xml:space="preserve"> Edge: </w:t>
+      </w:r>
+      <w:r>
+        <w:t xml:space="preserve">Concentrated rings or wrinkled skin </w:t>
+      </w:r>
+    </w:p>
+    <w:p>
+      <w:pPr>
+        <w:pStyle w:val="ListParagraph"/>
+        <w:numPr>
+          <w:ilvl w:val="1"/>
+          <w:numId w:val="3"/>
+        </w:numPr>
+        <w:rPr>
+          <w:b/>
+          <w:bCs/>
+        </w:rPr>
+      </w:pPr>
+      <w:r>
+        <w:rPr>
+          <w:b/>
+          <w:bCs/>
+        </w:rPr>
+        <w:t>Grad-CAM:</w:t>
+      </w:r>
+    </w:p>
+    <w:p>
+      <w:pPr>
+        <w:rPr>
+          <w:b/>
+          <w:bCs/>
+        </w:rPr>
+      </w:pPr>
+      <w:r>
+        <w:rPr>
+          <w:b/>
+          <w:bCs/>
+        </w:rPr>
+        <w:t>Physical Distress:</w:t>
+      </w:r>
+    </w:p>
+    <w:p>
+      <w:pPr>
+        <w:pStyle w:val="ListParagraph"/>
+        <w:numPr>
+          <w:ilvl w:val="0"/>
+          <w:numId w:val="3"/>
+        </w:numPr>
+        <w:rPr>
+          <w:b/>
+          <w:bCs/>
+        </w:rPr>
+      </w:pPr>
+      <w:r>
+        <w:rPr>
+          <w:b/>
+          <w:bCs/>
+        </w:rPr>
+        <w:t xml:space="preserve">Blackspot Bruising and Cracking: </w:t>
+      </w:r>
+    </w:p>
+    <w:p>
+      <w:pPr>
+        <w:pStyle w:val="ListParagraph"/>
+        <w:numPr>
+          <w:ilvl w:val="1"/>
+          <w:numId w:val="3"/>
+        </w:numPr>
+        <w:rPr>
+          <w:b/>
+          <w:bCs/>
+        </w:rPr>
+      </w:pPr>
+      <w:r>
+        <w:rPr>
+          <w:b/>
+          <w:bCs/>
+        </w:rPr>
+        <w:t xml:space="preserve">Sobel Edge: </w:t>
+      </w:r>
+      <w:r>
+        <w:t>Identifies cracks/line on the potato where color would not be useful.</w:t>
+      </w:r>
+    </w:p>
+    <w:p>
+      <w:pPr>
+        <w:pStyle w:val="ListParagraph"/>
+        <w:numPr>
+          <w:ilvl w:val="1"/>
+          <w:numId w:val="3"/>
+        </w:numPr>
+        <w:rPr>
+          <w:b/>
+          <w:bCs/>
+        </w:rPr>
+      </w:pPr>
+      <w:r>
+        <w:rPr>
+          <w:b/>
+          <w:bCs/>
+        </w:rPr>
+        <w:t xml:space="preserve">Grayscale: </w:t>
+      </w:r>
+      <w:r>
+        <w:t>Shadows created from deep edges and internal bruising that don’t have a distinct color change.</w:t>
+      </w:r>
+    </w:p>
+    <w:p>
+      <w:pPr>
+        <w:rPr>
+          <w:b/>
+          <w:bCs/>
+        </w:rPr>
+      </w:pPr>
+      <w:r>
+        <w:rPr>
+          <w:b/>
+          <w:bCs/>
+        </w:rPr>
+        <w:t>Pests and PSTVD:</w:t>
+      </w:r>
+    </w:p>
+    <w:p>
+      <w:pPr>
+        <w:rPr>
+          <w:b/>
+          <w:bCs/>
+        </w:rPr>
+      </w:pPr>
+    </w:p>
+    <w:p>
+      <w:pPr>
+        <w:rPr>
+          <w:b/>
+          <w:bCs/>
+        </w:rPr>
+      </w:pPr>
+    </w:p>
+    <w:p>
+      <w:pPr>
+        <w:rPr>
+          <w:b/>
+          <w:bCs/>
+        </w:rPr>
+      </w:pPr>
+    </w:p>
+    <w:p>
+      <w:pPr>
+        <w:rPr>
+          <w:b/>
+          <w:bCs/>
+        </w:rPr>
+      </w:pPr>
+      <w:r>
+        <w:rPr>
+          <w:b/>
+          <w:bCs/>
+        </w:rPr>
+        <w:t xml:space="preserve">Fig. </w:t>
+      </w:r>
+      <w:r>
+        <w:rPr>
+          <w:b/>
+          <w:bCs/>
+        </w:rPr>
+        <w:t xml:space="preserve"> </w:t>
+      </w:r>
+    </w:p>
+    <w:p>
+      <w:pPr>
+        <w:rPr>
+          <w:b/>
+          <w:bCs/>
+        </w:rPr>
+      </w:pPr>
+      <w:r>
+        <w:rPr>
+          <w:b/>
+          <w:bCs/>
+        </w:rPr>
+        <w:drawing>
+          <wp:inline distT="0" distB="0" distL="0" distR="0" wp14:anchorId="004E34A7" wp14:editId="6C3529D6">
+            <wp:extent cx="5943600" cy="3122930"/>
+            <wp:effectExtent l="0" t="0" r="0" b="1270"/>
+            <wp:docPr id="1576892610" name="Picture 1"/>
+            <wp:cNvGraphicFramePr>
+              <a:graphicFrameLocks xmlns:a="http://schemas.openxmlformats.org/drawingml/2006/main" noChangeAspect="1"/>
+            </wp:cNvGraphicFramePr>
+            <a:graphic xmlns:a="http://schemas.openxmlformats.org/drawingml/2006/main">
+              <a:graphicData uri="http://schemas.openxmlformats.org/drawingml/2006/picture">
+                <pic:pic xmlns:pic="http://schemas.openxmlformats.org/drawingml/2006/picture">
+                  <pic:nvPicPr>
+                    <pic:cNvPr id="1576892610" name=""/>
+                    <pic:cNvPicPr/>
+                  </pic:nvPicPr>
+                  <pic:blipFill>
+                    <a:blip r:embed="rId15"/>
+                    <a:stretch>
+                      <a:fillRect/>
+                    </a:stretch>
+                  </pic:blipFill>
+                  <pic:spPr>
+                    <a:xfrm>
+                      <a:off x="0" y="0"/>
+                      <a:ext cx="5943600" cy="3122930"/>
+                    </a:xfrm>
+                    <a:prstGeom prst="rect">
+                      <a:avLst/>
+                    </a:prstGeom>
+                  </pic:spPr>
+                </pic:pic>
+              </a:graphicData>
+            </a:graphic>
+          </wp:inline>
+        </w:drawing>
+      </w:r>
+    </w:p>
+    <w:p>
+      <w:pPr>
+        <w:pStyle w:val="ListParagraph"/>
+        <w:numPr>
+          <w:ilvl w:val="0"/>
+          <w:numId w:val="3"/>
+        </w:numPr>
+        <w:rPr>
+          <w:b/>
+          <w:bCs/>
+        </w:rPr>
+      </w:pPr>
+      <w:r>
+        <w:rPr>
+          <w:b/>
+          <w:bCs/>
+        </w:rPr>
+        <w:t>Aphids</w:t>
+      </w:r>
+    </w:p>
+    <w:p>
+      <w:pPr>
+        <w:pStyle w:val="ListParagraph"/>
+        <w:numPr>
+          <w:ilvl w:val="1"/>
+          <w:numId w:val="3"/>
+        </w:numPr>
+        <w:rPr>
+          <w:b/>
+          <w:bCs/>
+        </w:rPr>
+      </w:pPr>
+      <w:r>
+        <w:rPr>
+          <w:b/>
+          <w:bCs/>
+        </w:rPr>
+        <w:t>RGB/Grayscale</w:t>
+      </w:r>
+    </w:p>
+    <w:p>
+      <w:pPr>
+        <w:pStyle w:val="ListParagraph"/>
+        <w:numPr>
+          <w:ilvl w:val="1"/>
+          <w:numId w:val="3"/>
+        </w:numPr>
+        <w:rPr>
+          <w:b/>
+          <w:bCs/>
+        </w:rPr>
+      </w:pPr>
+      <w:r>
+        <w:rPr>
+          <w:b/>
+          <w:bCs/>
+        </w:rPr>
+        <w:t xml:space="preserve">Sobel Edge: </w:t>
+      </w:r>
+      <w:r>
+        <w:t>Aphids are tiny, identifies leaf distortion from infestation</w:t>
+      </w:r>
+    </w:p>
+    <w:p>
+      <w:pPr>
+        <w:pStyle w:val="ListParagraph"/>
+        <w:numPr>
+          <w:ilvl w:val="1"/>
+          <w:numId w:val="3"/>
+        </w:numPr>
+        <w:rPr>
+          <w:b/>
+          <w:bCs/>
+        </w:rPr>
+      </w:pPr>
+      <w:r>
+        <w:rPr>
+          <w:b/>
+          <w:bCs/>
+        </w:rPr>
+        <w:t>Grad-CAM</w:t>
+      </w:r>
+    </w:p>
+    <w:p>
+      <w:pPr>
+        <w:pStyle w:val="ListParagraph"/>
+        <w:numPr>
+          <w:ilvl w:val="0"/>
+          <w:numId w:val="3"/>
+        </w:numPr>
+        <w:rPr>
+          <w:b/>
+          <w:bCs/>
+        </w:rPr>
+      </w:pPr>
+      <w:r>
+        <w:rPr>
+          <w:b/>
+          <w:bCs/>
+        </w:rPr>
+        <w:t>PSTVD:</w:t>
+      </w:r>
+    </w:p>
+    <w:p>
+      <w:pPr>
+        <w:pStyle w:val="ListParagraph"/>
+        <w:numPr>
+          <w:ilvl w:val="1"/>
+          <w:numId w:val="3"/>
+        </w:numPr>
+        <w:rPr>
+          <w:b/>
+          <w:bCs/>
+        </w:rPr>
+      </w:pPr>
+      <w:r>
+        <w:rPr>
+          <w:b/>
+          <w:bCs/>
+        </w:rPr>
+        <w:t xml:space="preserve">RGB: </w:t>
+      </w:r>
+      <w:r>
+        <w:t>Identifies Spindly long tubers from color variation.</w:t>
+      </w:r>
+    </w:p>
+    <w:p>
+      <w:pPr>
+        <w:pStyle w:val="ListParagraph"/>
+        <w:numPr>
+          <w:ilvl w:val="1"/>
+          <w:numId w:val="3"/>
+        </w:numPr>
+        <w:rPr>
+          <w:b/>
+          <w:bCs/>
+        </w:rPr>
+      </w:pPr>
+      <w:r>
+        <w:rPr>
+          <w:b/>
+          <w:bCs/>
+        </w:rPr>
+        <w:t>Sobel</w:t>
+      </w:r>
+      <w:r>
+        <w:rPr>
+          <w:b/>
+          <w:bCs/>
+        </w:rPr>
+        <w:t xml:space="preserve"> Edge</w:t>
+      </w:r>
+      <w:r>
+        <w:rPr>
+          <w:b/>
+          <w:bCs/>
+        </w:rPr>
+        <w:t xml:space="preserve">: </w:t>
+      </w:r>
+      <w:r>
+        <w:t>Identify height of tube is abnormal.</w:t>
+      </w:r>
+    </w:p>
+    <w:p>
+      <w:pPr>
+        <w:pStyle w:val="ListParagraph"/>
+        <w:numPr>
+          <w:ilvl w:val="1"/>
+          <w:numId w:val="3"/>
+        </w:numPr>
+        <w:rPr>
+          <w:b/>
+          <w:bCs/>
+        </w:rPr>
+      </w:pPr>
+      <w:r>
+        <w:rPr>
+          <w:b/>
+          <w:bCs/>
+        </w:rPr>
+        <w:t>Grad-CAM</w:t>
+      </w:r>
+    </w:p>
+    <w:p>
+      <w:pPr>
+        <w:rPr>
+          <w:b/>
+          <w:bCs/>
+        </w:rPr>
+      </w:pPr>
+      <w:r>
+        <w:rPr>
+          <w:b/>
+          <w:bCs/>
+        </w:rPr>
+        <w:t>CODE BRANCHES</w:t>
+      </w:r>
+    </w:p>
+    <w:p>
+      <w:r>
+        <w:rPr>
+          <w:b/>
+          <w:bCs/>
+        </w:rPr>
+        <w:t>Data Preprocessing</w:t>
+      </w:r>
+      <w:r>
+        <w:t>:</w:t>
+      </w:r>
+    </w:p>
+    <w:p>
+      <w:r>
+        <w:t xml:space="preserve">Datasets from Kaggle and Mendeley are loaded in. Each image is resized and made to be one image file type. </w:t>
+      </w:r>
+    </w:p>
+    <w:p/>
+    <w:p>
+      <w:pPr>
+        <w:rPr>
+          <w:b/>
+          <w:bCs/>
+        </w:rPr>
+      </w:pPr>
+      <w:r>
+        <w:rPr>
+          <w:b/>
+          <w:bCs/>
+        </w:rPr>
+        <w:t>RGB</w:t>
+      </w:r>
+      <w:r>
+        <w:rPr>
+          <w:b/>
+          <w:bCs/>
+        </w:rPr>
+        <w:t>.py:</w:t>
+      </w:r>
+    </w:p>
+    <w:p>
+      <w:r>
+        <w:lastRenderedPageBreak/>
+        <w:t xml:space="preserve">Convolution layer, with 32 filters and a 3x3 kernel size. Pooling. Activation ReLu for hidden layers. Compute f(x) = max(0,x), replace all negative pixel values with zero. This allows the model network to learn non-linear patterns. It lets the model draw curvy boundaries between ‘Healthy’ and ‘Sick’. A 3x3 filter is placed over the images, the padding layer adds a border of zeros/empty pixels around the original image. It prevents the images from shrinking as it passes through the layers. </w:t>
+      </w:r>
+    </w:p>
+    <w:p>
+      <w:r>
+        <w:t xml:space="preserve">The pooling layer puts a 2x2 window over the feature map. Reducing pixels down to 1, choosing the strongest signal, discarding the other as noise. Drop out is set to 30%. Meaning the model randomly turns off 30% of neurons every single training step. The model can’t rely on just seeing that certain pixels are always green and then classifying the potato leaf as healthy. </w:t>
+      </w:r>
+    </w:p>
+    <w:p>
+      <w:pPr>
+        <w:rPr>
+          <w:b/>
+          <w:bCs/>
+        </w:rPr>
+      </w:pPr>
+      <w:r>
+        <w:rPr>
+          <w:b/>
+          <w:bCs/>
+        </w:rPr>
+        <w:t>Grayscale.py:</w:t>
+      </w:r>
+    </w:p>
+    <w:p>
+      <w:r>
+        <w:t>Flattens to a single channel for pixel intensity and shadows.</w:t>
+      </w:r>
+      <w:r>
+        <w:t xml:space="preserve"> </w:t>
+      </w:r>
+      <w:r>
+        <w:t xml:space="preserve">Deals with lighting, higher contrast on cracks and folds. </w:t>
+      </w:r>
+      <w:r>
+        <w:t>Including grayscale baseline, investigating if color is a 'crutch' for the model</w:t>
+      </w:r>
+      <w:r>
+        <w:t xml:space="preserve">. </w:t>
+      </w:r>
+    </w:p>
+    <w:p>
+      <w:pPr>
+        <w:pStyle w:val="ListParagraph"/>
+        <w:numPr>
+          <w:ilvl w:val="0"/>
+          <w:numId w:val="3"/>
+        </w:numPr>
+      </w:pPr>
+      <w:r>
+        <w:t xml:space="preserve">The model is learning to treat shadows as low intensity pixels, being able to distinguish between dark spots that are caused by shadows and actual ones caused by disease. </w:t>
+      </w:r>
+    </w:p>
+    <w:p>
+      <w:pPr>
+        <w:rPr>
+          <w:b/>
+          <w:bCs/>
+        </w:rPr>
+      </w:pPr>
+      <w:r>
+        <w:rPr>
+          <w:b/>
+          <w:bCs/>
+        </w:rPr>
+        <w:t>Sobel_edge.py:</w:t>
+      </w:r>
+    </w:p>
+    <w:p>
+      <w:pPr>
+        <w:rPr>
+          <w:b/>
+          <w:bCs/>
+        </w:rPr>
+      </w:pPr>
+      <w:r>
+        <w:t xml:space="preserve">Sobel Edge Detection: Filter that strips asway all color and texture leaving only structural boundaries (Veins, lesions, and holes). It calculates the sudden change in pixel brightness horizontally and vertically. Uses 2 different kernels for horizontal and vertical. Reduces blur that might come from …. Enhances edges, </w:t>
+      </w:r>
+    </w:p>
+    <w:p>
+      <w:r>
+        <w:t xml:space="preserve">Image gradients for high contrast map of edges of lesions and leaf edges. </w:t>
+      </w:r>
+    </w:p>
+    <w:p>
+      <w:pPr>
+        <w:pStyle w:val="ListParagraph"/>
+        <w:numPr>
+          <w:ilvl w:val="1"/>
+          <w:numId w:val="1"/>
+        </w:numPr>
+        <w:ind w:left="1800"/>
+      </w:pPr>
+      <w:r>
+        <w:rPr>
+          <w:b/>
+          <w:bCs/>
+        </w:rPr>
+        <w:t>Formula for magnitude</w:t>
+      </w:r>
+      <w:r>
+        <w:t xml:space="preserve">: </w:t>
+      </w:r>
+    </w:p>
+    <w:p>
+      <w:pPr>
+        <w:ind w:left="1080" w:firstLine="720"/>
+      </w:pPr>
+      <w:r>
+        <w:t>Magnitude = sqrt(G_x^2 + G_y^2)</w:t>
+      </w:r>
+    </w:p>
+    <w:p>
+      <w:pPr>
+        <w:ind w:left="1080" w:firstLine="720"/>
+      </w:pPr>
+      <w:r>
+        <w:t>G_x : left to right change, compares pixel from the left to right (vertical)</w:t>
+      </w:r>
+    </w:p>
+    <w:p>
+      <w:pPr>
+        <w:ind w:left="1080" w:firstLine="720"/>
+      </w:pPr>
+      <w:r>
+        <w:t>G_y : up and down (horizontal)</w:t>
+      </w:r>
+    </w:p>
+    <w:p>
+      <w:pPr>
+        <w:ind w:left="1080" w:firstLine="720"/>
+      </w:pPr>
+      <w:r>
+        <w:t>Large number means an edge, done for every pixel (8 immediate neighbors)</w:t>
+      </w:r>
+    </w:p>
+    <w:p/>
+    <w:p>
+      <w:pPr>
+        <w:rPr>
+          <w:b/>
+          <w:bCs/>
+        </w:rPr>
+      </w:pPr>
+      <w:r>
+        <w:rPr>
+          <w:b/>
+          <w:bCs/>
+        </w:rPr>
+        <w:lastRenderedPageBreak/>
+        <w:t>Grad_cam.py:</w:t>
+      </w:r>
+    </w:p>
+    <w:p>
+      <w:r>
+        <w:t>Post-processing, heatmaps on test images</w:t>
+      </w:r>
+    </w:p>
+    <w:p>
+      <w:pPr>
+        <w:rPr>
+          <w:b/>
+          <w:bCs/>
+        </w:rPr>
+      </w:pPr>
+      <w:r>
+        <w:rPr>
+          <w:b/>
+          <w:bCs/>
+        </w:rPr>
+        <w:t>Train_model.py</w:t>
+      </w:r>
+      <w:r>
+        <w:rPr>
+          <w:b/>
+          <w:bCs/>
+        </w:rPr>
+        <w:t>:</w:t>
+      </w:r>
+    </w:p>
+    <w:p>
+      <w:r>
+        <w:t>Output from all branches coming together</w:t>
+      </w:r>
+    </w:p>
+    <w:p>
+      <w:pPr>
+        <w:rPr>
+          <w:b/>
+          <w:bCs/>
+        </w:rPr>
+      </w:pPr>
+      <w:r>
+        <w:rPr>
+          <w:b/>
+          <w:bCs/>
+        </w:rPr>
+        <w:t>Image_view.py:</w:t>
+      </w:r>
+    </w:p>
+    <w:p>
+      <w:r>
+        <w:t>Sampling images with folder name (class name) to be able to compare lab and field photos and see what</w:t>
+      </w:r>
+      <w:r>
+        <w:t xml:space="preserve"> the</w:t>
+      </w:r>
+      <w:r>
+        <w:t xml:space="preserve"> image outputs for rgb/grayscale and sobel</w:t>
+      </w:r>
+      <w:r>
+        <w:t xml:space="preserve"> are. </w:t>
+      </w:r>
+    </w:p>
+    <w:p>
+      <w:pPr>
+        <w:rPr>
+          <w:b/>
+          <w:bCs/>
+        </w:rPr>
+      </w:pPr>
+      <w:r>
+        <w:rPr>
+          <w:b/>
+          <w:bCs/>
+        </w:rPr>
+        <w:t>Training/Validating Data:</w:t>
+      </w:r>
+    </w:p>
+    <w:p>
+      <w:r>
+        <w:t xml:space="preserve">70/30 split to train the model. Train/validation/test split will be done </w:t>
+      </w:r>
+      <w:r>
+        <w:t xml:space="preserve">later on </w:t>
+      </w:r>
+      <w:r>
+        <w:t>once N</w:t>
+      </w:r>
+      <w:r>
+        <w:t>ASA</w:t>
+      </w:r>
+      <w:r>
+        <w:t xml:space="preserve"> weather API data is added. For now, the CNN model is being tested on whether it can see the difference between a healthy leaf and a sick one</w:t>
+      </w:r>
+      <w:r>
+        <w:t xml:space="preserve"> form lab/Kaggle data</w:t>
+      </w:r>
+      <w:r>
+        <w:t>.</w:t>
+      </w:r>
+      <w:r>
+        <w:t xml:space="preserve"> After, model will be trained on field data to introduce more noise. Last stage of data runs with NASA API data to validate the results. </w:t>
+      </w:r>
+    </w:p>
+    <w:p>
+      <w:r>
+        <w:t>All the data that has been acquired is publicly accessed. Limitations of sourcing, making sure the model is not cheating at the end</w:t>
+      </w:r>
+      <w:r>
+        <w:t xml:space="preserve"> after weather data is added to</w:t>
+      </w:r>
+      <w:r>
+        <w:t xml:space="preserve"> determine disease.</w:t>
+      </w:r>
+      <w:r>
+        <w:t xml:space="preserve"> </w:t>
+      </w:r>
+    </w:p>
+    <w:p>
+      <w:pPr>
+        <w:rPr>
+          <w:b/>
+          <w:bCs/>
+        </w:rPr>
+      </w:pPr>
+      <w:r>
+        <w:rPr>
+          <w:b/>
+          <w:bCs/>
+        </w:rPr>
         <w:t xml:space="preserve">Dual Branch: RHB/ Grayscale and Edges </w:t>
       </w:r>
     </w:p>
@@ -350,17 +2251,24 @@
           <w:b/>
           <w:bCs/>
         </w:rPr>
-        <w:t>CIE Lab (lightness and color)</w:t>
-      </w:r>
-    </w:p>
-    <w:p>
-      <w:pPr>
-        <w:rPr>
-          <w:b/>
-          <w:bCs/>
-        </w:rPr>
-      </w:pPr>
-      <w:hyperlink r:id="rId6" w:history="1">
+        <w:t>(L</w:t>
+      </w:r>
+      <w:r>
+        <w:rPr>
+          <w:b/>
+          <w:bCs/>
+        </w:rPr>
+        <w:t>ightness and color)</w:t>
+      </w:r>
+    </w:p>
+    <w:p>
+      <w:pPr>
+        <w:rPr>
+          <w:b/>
+          <w:bCs/>
+        </w:rPr>
+      </w:pPr>
+      <w:hyperlink r:id="rId16" w:history="1">
         <w:r>
           <w:rPr>
             <w:rStyle w:val="Hyperlink"/>
@@ -421,184 +2329,15 @@
     </w:p>
     <w:p>
       <w:r>
-        <w:t xml:space="preserve"> For this project, interpretability is chosen to make sure that the model is also keeping in mind edge detection as well and not only relying on color to accurately predict disease. </w:t>
+        <w:lastRenderedPageBreak/>
+        <w:t xml:space="preserve">For this project, interpretability is chosen to make sure that the model is also keeping in mind edge detection as well and not only relying on color to accurately predict disease. </w:t>
       </w:r>
       <w:r>
         <w:t xml:space="preserve">Sobel edges are used in the model to force the second branch to ignore shadows entirely and only look at lesion boundaries </w:t>
       </w:r>
     </w:p>
-    <w:p>
-      <w:r>
-        <w:rPr>
-          <w:b/>
-          <w:bCs/>
-        </w:rPr>
-        <w:t>Code for Tensorflow and Keras:</w:t>
-      </w:r>
-      <w:r>
-        <w:rPr>
-          <w:b/>
-          <w:bCs/>
-        </w:rPr>
-        <w:br/>
-      </w:r>
-      <w:r>
-        <w:rPr>
-          <w:b/>
-          <w:bCs/>
-        </w:rPr>
-        <w:t xml:space="preserve">RGB </w:t>
-      </w:r>
-      <w:r>
-        <w:rPr>
-          <w:b/>
-          <w:bCs/>
-        </w:rPr>
-        <w:t>Code B</w:t>
-      </w:r>
-      <w:r>
-        <w:rPr>
-          <w:b/>
-          <w:bCs/>
-        </w:rPr>
-        <w:t>ranch:</w:t>
-      </w:r>
-    </w:p>
-    <w:p>
-      <w:r>
-        <w:t>Keras, and by extension, tensorflow is used to create the CNN model.</w:t>
-      </w:r>
-      <w:r>
-        <w:t xml:space="preserve"> </w:t>
-      </w:r>
-      <w:r>
-        <w:t>Convolution</w:t>
-      </w:r>
-      <w:r>
-        <w:t xml:space="preserve"> layer, </w:t>
-      </w:r>
-      <w:r>
-        <w:t xml:space="preserve">with 32 filters and a 3x3 kernel size. </w:t>
-      </w:r>
-      <w:r>
-        <w:t xml:space="preserve">Pooling. Activation ReLu for hidden layers. </w:t>
-      </w:r>
-      <w:r>
-        <w:t xml:space="preserve">Compute </w:t>
-      </w:r>
-      <w:r>
-        <w:t xml:space="preserve">f(x) = max(0,x), replace all negative pixel values with zero. </w:t>
-      </w:r>
-      <w:r>
-        <w:t xml:space="preserve">This allows the model network to learn non-linear patterns. It lets the model draw curvy boundaries between ‘Healthy’ and ‘Sick’. A 3x3 filter is placed over the images, the padding layer adds a border of zeros/empty pixels around the original image. It prevents the images from shrinking as it passes through the layers. </w:t>
-      </w:r>
-      <w:r>
-        <w:t>Grad-CAM.</w:t>
-      </w:r>
-    </w:p>
-    <w:p>
-      <w:r>
-        <w:t xml:space="preserve">The pooling layer puts a 2x2 window over the feature map. Reducing </w:t>
-      </w:r>
-      <w:r>
-        <w:t>pixels</w:t>
-      </w:r>
-      <w:r>
-        <w:t xml:space="preserve"> down to 1, choosing the strongest signal, discarding the other as noise. Drop out is set to 30%. Meaning the model randomly turns off 30% of neurons every single training step.</w:t>
-      </w:r>
-      <w:r>
-        <w:t xml:space="preserve"> The model can’t rely on just seeing that certain pixels </w:t>
-      </w:r>
-      <w:r>
-        <w:t>are</w:t>
-      </w:r>
-      <w:r>
-        <w:t xml:space="preserve"> always </w:t>
-      </w:r>
-      <w:r>
-        <w:t>green and</w:t>
-      </w:r>
-      <w:r>
-        <w:t xml:space="preserve"> then classifying the potato leaf as healthy. </w:t>
-      </w:r>
-    </w:p>
-    <w:p>
-      <w:pPr>
-        <w:pStyle w:val="ListParagraph"/>
-        <w:numPr>
-          <w:ilvl w:val="0"/>
-          <w:numId w:val="1"/>
-        </w:numPr>
-      </w:pPr>
-      <w:r>
-        <w:lastRenderedPageBreak/>
-        <w:t xml:space="preserve">Add the math for ReLu layers and </w:t>
-      </w:r>
-    </w:p>
-    <w:p>
-      <w:pPr>
-        <w:rPr>
-          <w:b/>
-          <w:bCs/>
-        </w:rPr>
-      </w:pPr>
-      <w:r>
-        <w:rPr>
-          <w:b/>
-          <w:bCs/>
-        </w:rPr>
-        <w:t xml:space="preserve">Grayscale Code Branch: </w:t>
-      </w:r>
-    </w:p>
-    <w:p>
-      <w:pPr>
-        <w:rPr>
-          <w:b/>
-          <w:bCs/>
-        </w:rPr>
-      </w:pPr>
-    </w:p>
-    <w:p>
-      <w:pPr>
-        <w:rPr>
-          <w:b/>
-          <w:bCs/>
-        </w:rPr>
-      </w:pPr>
-      <w:r>
-        <w:rPr>
-          <w:b/>
-          <w:bCs/>
-        </w:rPr>
-        <w:t>Sobel Edge with Grad Cam:</w:t>
-      </w:r>
-    </w:p>
-    <w:p>
-      <w:r>
-        <w:t>Sobel Edge Detection: Filter that strips asway all color and texture leaving only structural boundaries (Veins, lesions, and holes).</w:t>
-      </w:r>
-    </w:p>
-    <w:p>
-      <w:r>
-        <w:t>Grad CAM: Creates heatmap to visualize which parts of an image a CNN model is focused on.</w:t>
-      </w:r>
-    </w:p>
-    <w:p>
-      <w:r>
-        <w:t>Is the model detecting the shape of the edges that the virus has created or is it just looking at a random shadow in the background.</w:t>
-      </w:r>
-    </w:p>
-    <w:p>
-      <w:r>
-        <w:t>Model uses the last convolution layer as the image has passed through all filters that recognized simple concepts like edges, corners and simple lines. Dense layer, model already has the answer of what disease it is, but it’s not looking at where the evidence is on the image.</w:t>
-      </w:r>
-    </w:p>
     <w:p/>
-    <w:p>
-      <w:r>
-        <w:t>If I tweaked the pixels in the Feature Maps slightly, how much would the 'Early Blight' score change?</w:t>
-      </w:r>
-    </w:p>
+    <w:p/>
     <w:sectPr>
       <w:pgSz w:w="12240" w:h="15840"/>
       <w:pgMar w:top="1440" w:right="1440" w:bottom="1440" w:left="1440" w:header="720" w:footer="720" w:gutter="0"/>
@@ -609,13 +2348,63 @@
 </w:document>
 </file>
 
+<file path=word/endnotes.xml><?xml version="1.0" encoding="utf-8"?>
+<w:endnotes xmlns:wpc="http://schemas.microsoft.com/office/word/2010/wordprocessingCanvas" xmlns:cx="http://schemas.microsoft.com/office/drawing/2014/chartex" xmlns:cx1="http://schemas.microsoft.com/office/drawing/2015/9/8/chartex" xmlns:cx2="http://schemas.microsoft.com/office/drawing/2015/10/21/chartex" xmlns:cx3="http://schemas.microsoft.com/office/drawing/2016/5/9/chartex" xmlns:cx4="http://schemas.microsoft.com/office/drawing/2016/5/10/chartex" xmlns:cx5="http://schemas.microsoft.com/office/drawing/2016/5/11/chartex" xmlns:cx6="http://schemas.microsoft.com/office/drawing/2016/5/12/chartex" xmlns:cx7="http://schemas.microsoft.com/office/drawing/2016/5/13/chartex" xmlns:cx8="http://schemas.microsoft.com/office/drawing/2016/5/14/chartex" xmlns:mc="http://schemas.openxmlformats.org/markup-compatibility/2006" xmlns:aink="http://schemas.microsoft.com/office/drawing/2016/ink" xmlns:am3d="http://schemas.microsoft.com/office/drawing/2017/model3d" xmlns:o="urn:schemas-microsoft-com:office:office" xmlns:oel="http://schemas.microsoft.com/office/2019/extlst" xmlns:r="http://schemas.openxmlformats.org/officeDocument/2006/relationships" xmlns:m="http://schemas.openxmlformats.org/officeDocument/2006/math" xmlns:v="urn:schemas-microsoft-com:vml" xmlns:wp14="http://schemas.microsoft.com/office/word/2010/wordprocessingDrawing" xmlns:wp="http://schemas.openxmlformats.org/drawingml/2006/wordprocessingDrawing" xmlns:w10="urn:schemas-microsoft-com:office:word" xmlns:w="http://schemas.openxmlformats.org/wordprocessingml/2006/main" xmlns:w14="http://schemas.microsoft.com/office/word/2010/wordml" xmlns:w15="http://schemas.microsoft.com/office/word/2012/wordml" xmlns:w16cex="http://schemas.microsoft.com/office/word/2018/wordml/cex" xmlns:w16cid="http://schemas.microsoft.com/office/word/2016/wordml/cid" xmlns:w16="http://schemas.microsoft.com/office/word/2018/wordml" xmlns:w16du="http://schemas.microsoft.com/office/word/2023/wordml/word16du" xmlns:w16sdtdh="http://schemas.microsoft.com/office/word/2020/wordml/sdtdatahash" xmlns:w16sdtfl="http://schemas.microsoft.com/office/word/2024/wordml/sdtformatlock" xmlns:w16se="http://schemas.microsoft.com/office/word/2015/wordml/symex" xmlns:wpg="http://schemas.microsoft.com/office/word/2010/wordprocessingGroup" xmlns:wpi="http://schemas.microsoft.com/office/word/2010/wordprocessingInk" xmlns:wne="http://schemas.microsoft.com/office/word/2006/wordml" xmlns:wps="http://schemas.microsoft.com/office/word/2010/wordprocessingShape" mc:Ignorable="w14 w15 w16se w16cid w16 w16cex w16sdtdh w16sdtfl w16du wp14">
+  <w:endnote w:type="separator" w:id="-1">
+    <w:p>
+      <w:pPr>
+        <w:spacing w:after="0" w:line="240" w:lineRule="auto"/>
+      </w:pPr>
+      <w:r>
+        <w:separator/>
+      </w:r>
+    </w:p>
+  </w:endnote>
+  <w:endnote w:type="continuationSeparator" w:id="0">
+    <w:p>
+      <w:pPr>
+        <w:spacing w:after="0" w:line="240" w:lineRule="auto"/>
+      </w:pPr>
+      <w:r>
+        <w:continuationSeparator/>
+      </w:r>
+    </w:p>
+  </w:endnote>
+</w:endnotes>
+</file>
+
+<file path=word/footnotes.xml><?xml version="1.0" encoding="utf-8"?>
+<w:footnotes xmlns:wpc="http://schemas.microsoft.com/office/word/2010/wordprocessingCanvas" xmlns:cx="http://schemas.microsoft.com/office/drawing/2014/chartex" xmlns:cx1="http://schemas.microsoft.com/office/drawing/2015/9/8/chartex" xmlns:cx2="http://schemas.microsoft.com/office/drawing/2015/10/21/chartex" xmlns:cx3="http://schemas.microsoft.com/office/drawing/2016/5/9/chartex" xmlns:cx4="http://schemas.microsoft.com/office/drawing/2016/5/10/chartex" xmlns:cx5="http://schemas.microsoft.com/office/drawing/2016/5/11/chartex" xmlns:cx6="http://schemas.microsoft.com/office/drawing/2016/5/12/chartex" xmlns:cx7="http://schemas.microsoft.com/office/drawing/2016/5/13/chartex" xmlns:cx8="http://schemas.microsoft.com/office/drawing/2016/5/14/chartex" xmlns:mc="http://schemas.openxmlformats.org/markup-compatibility/2006" xmlns:aink="http://schemas.microsoft.com/office/drawing/2016/ink" xmlns:am3d="http://schemas.microsoft.com/office/drawing/2017/model3d" xmlns:o="urn:schemas-microsoft-com:office:office" xmlns:oel="http://schemas.microsoft.com/office/2019/extlst" xmlns:r="http://schemas.openxmlformats.org/officeDocument/2006/relationships" xmlns:m="http://schemas.openxmlformats.org/officeDocument/2006/math" xmlns:v="urn:schemas-microsoft-com:vml" xmlns:wp14="http://schemas.microsoft.com/office/word/2010/wordprocessingDrawing" xmlns:wp="http://schemas.openxmlformats.org/drawingml/2006/wordprocessingDrawing" xmlns:w10="urn:schemas-microsoft-com:office:word" xmlns:w="http://schemas.openxmlformats.org/wordprocessingml/2006/main" xmlns:w14="http://schemas.microsoft.com/office/word/2010/wordml" xmlns:w15="http://schemas.microsoft.com/office/word/2012/wordml" xmlns:w16cex="http://schemas.microsoft.com/office/word/2018/wordml/cex" xmlns:w16cid="http://schemas.microsoft.com/office/word/2016/wordml/cid" xmlns:w16="http://schemas.microsoft.com/office/word/2018/wordml" xmlns:w16du="http://schemas.microsoft.com/office/word/2023/wordml/word16du" xmlns:w16sdtdh="http://schemas.microsoft.com/office/word/2020/wordml/sdtdatahash" xmlns:w16sdtfl="http://schemas.microsoft.com/office/word/2024/wordml/sdtformatlock" xmlns:w16se="http://schemas.microsoft.com/office/word/2015/wordml/symex" xmlns:wpg="http://schemas.microsoft.com/office/word/2010/wordprocessingGroup" xmlns:wpi="http://schemas.microsoft.com/office/word/2010/wordprocessingInk" xmlns:wne="http://schemas.microsoft.com/office/word/2006/wordml" xmlns:wps="http://schemas.microsoft.com/office/word/2010/wordprocessingShape" mc:Ignorable="w14 w15 w16se w16cid w16 w16cex w16sdtdh w16sdtfl w16du wp14">
+  <w:footnote w:type="separator" w:id="-1">
+    <w:p>
+      <w:pPr>
+        <w:spacing w:after="0" w:line="240" w:lineRule="auto"/>
+      </w:pPr>
+      <w:r>
+        <w:separator/>
+      </w:r>
+    </w:p>
+  </w:footnote>
+  <w:footnote w:type="continuationSeparator" w:id="0">
+    <w:p>
+      <w:pPr>
+        <w:spacing w:after="0" w:line="240" w:lineRule="auto"/>
+      </w:pPr>
+      <w:r>
+        <w:continuationSeparator/>
+      </w:r>
+    </w:p>
+  </w:footnote>
+</w:footnotes>
+</file>
+
 <file path=word/numbering.xml><?xml version="1.0" encoding="utf-8"?>
 <w:numbering xmlns:wpc="http://schemas.microsoft.com/office/word/2010/wordprocessingCanvas" xmlns:cx="http://schemas.microsoft.com/office/drawing/2014/chartex" xmlns:cx1="http://schemas.microsoft.com/office/drawing/2015/9/8/chartex" xmlns:cx2="http://schemas.microsoft.com/office/drawing/2015/10/21/chartex" xmlns:cx3="http://schemas.microsoft.com/office/drawing/2016/5/9/chartex" xmlns:cx4="http://schemas.microsoft.com/office/drawing/2016/5/10/chartex" xmlns:cx5="http://schemas.microsoft.com/office/drawing/2016/5/11/chartex" xmlns:cx6="http://schemas.microsoft.com/office/drawing/2016/5/12/chartex" xmlns:cx7="http://schemas.microsoft.com/office/drawing/2016/5/13/chartex" xmlns:cx8="http://schemas.microsoft.com/office/drawing/2016/5/14/chartex" xmlns:mc="http://schemas.openxmlformats.org/markup-compatibility/2006" xmlns:aink="http://schemas.microsoft.com/office/drawing/2016/ink" xmlns:am3d="http://schemas.microsoft.com/office/drawing/2017/model3d" xmlns:o="urn:schemas-microsoft-com:office:office" xmlns:oel="http://schemas.microsoft.com/office/2019/extlst" xmlns:r="http://schemas.openxmlformats.org/officeDocument/2006/relationships" xmlns:m="http://schemas.openxmlformats.org/officeDocument/2006/math" xmlns:v="urn:schemas-microsoft-com:vml" xmlns:wp14="http://schemas.microsoft.com/office/word/2010/wordprocessingDrawing" xmlns:wp="http://schemas.openxmlformats.org/drawingml/2006/wordprocessingDrawing" xmlns:w10="urn:schemas-microsoft-com:office:word" xmlns:w="http://schemas.openxmlformats.org/wordprocessingml/2006/main" xmlns:w14="http://schemas.microsoft.com/office/word/2010/wordml" xmlns:w15="http://schemas.microsoft.com/office/word/2012/wordml" xmlns:w16cex="http://schemas.microsoft.com/office/word/2018/wordml/cex" xmlns:w16cid="http://schemas.microsoft.com/office/word/2016/wordml/cid" xmlns:w16="http://schemas.microsoft.com/office/word/2018/wordml" xmlns:w16du="http://schemas.microsoft.com/office/word/2023/wordml/word16du" xmlns:w16sdtdh="http://schemas.microsoft.com/office/word/2020/wordml/sdtdatahash" xmlns:w16sdtfl="http://schemas.microsoft.com/office/word/2024/wordml/sdtformatlock" xmlns:w16se="http://schemas.microsoft.com/office/word/2015/wordml/symex" xmlns:wpg="http://schemas.microsoft.com/office/word/2010/wordprocessingGroup" xmlns:wpi="http://schemas.microsoft.com/office/word/2010/wordprocessingInk" xmlns:wne="http://schemas.microsoft.com/office/word/2006/wordml" xmlns:wps="http://schemas.microsoft.com/office/word/2010/wordprocessingShape" mc:Ignorable="w14 w15 w16se w16cid w16 w16cex w16sdtdh w16sdtfl w16du wp14">
   <w:abstractNum w:abstractNumId="0" w15:restartNumberingAfterBreak="0">
-    <w:nsid w:val="327D2A6F"/>
+    <w:nsid w:val="24C5494B"/>
     <w:multiLevelType w:val="hybridMultilevel"/>
-    <w:tmpl w:val="DE6A1630"/>
-    <w:lvl w:ilvl="0" w:tplc="F1F4A454">
+    <w:tmpl w:val="3C724FBA"/>
+    <w:lvl w:ilvl="0" w:tplc="D64CBEDA">
       <w:numFmt w:val="bullet"/>
       <w:lvlText w:val=""/>
       <w:lvlJc w:val="left"/>
@@ -723,8 +2512,238 @@
       </w:rPr>
     </w:lvl>
   </w:abstractNum>
+  <w:abstractNum w:abstractNumId="1" w15:restartNumberingAfterBreak="0">
+    <w:nsid w:val="327D2A6F"/>
+    <w:multiLevelType w:val="hybridMultilevel"/>
+    <w:tmpl w:val="DE6A1630"/>
+    <w:lvl w:ilvl="0" w:tplc="F1F4A454">
+      <w:numFmt w:val="bullet"/>
+      <w:lvlText w:val=""/>
+      <w:lvlJc w:val="left"/>
+      <w:pPr>
+        <w:ind w:left="720" w:hanging="360"/>
+      </w:pPr>
+      <w:rPr>
+        <w:rFonts w:ascii="Symbol" w:eastAsiaTheme="minorHAnsi" w:hAnsi="Symbol" w:cstheme="minorBidi" w:hint="default"/>
+      </w:rPr>
+    </w:lvl>
+    <w:lvl w:ilvl="1" w:tplc="04090003">
+      <w:start w:val="1"/>
+      <w:numFmt w:val="bullet"/>
+      <w:lvlText w:val="o"/>
+      <w:lvlJc w:val="left"/>
+      <w:pPr>
+        <w:ind w:left="1440" w:hanging="360"/>
+      </w:pPr>
+      <w:rPr>
+        <w:rFonts w:ascii="Courier New" w:hAnsi="Courier New" w:cs="Courier New" w:hint="default"/>
+      </w:rPr>
+    </w:lvl>
+    <w:lvl w:ilvl="2" w:tplc="04090005" w:tentative="1">
+      <w:start w:val="1"/>
+      <w:numFmt w:val="bullet"/>
+      <w:lvlText w:val=""/>
+      <w:lvlJc w:val="left"/>
+      <w:pPr>
+        <w:ind w:left="2160" w:hanging="360"/>
+      </w:pPr>
+      <w:rPr>
+        <w:rFonts w:ascii="Wingdings" w:hAnsi="Wingdings" w:hint="default"/>
+      </w:rPr>
+    </w:lvl>
+    <w:lvl w:ilvl="3" w:tplc="04090001" w:tentative="1">
+      <w:start w:val="1"/>
+      <w:numFmt w:val="bullet"/>
+      <w:lvlText w:val=""/>
+      <w:lvlJc w:val="left"/>
+      <w:pPr>
+        <w:ind w:left="2880" w:hanging="360"/>
+      </w:pPr>
+      <w:rPr>
+        <w:rFonts w:ascii="Symbol" w:hAnsi="Symbol" w:hint="default"/>
+      </w:rPr>
+    </w:lvl>
+    <w:lvl w:ilvl="4" w:tplc="04090003" w:tentative="1">
+      <w:start w:val="1"/>
+      <w:numFmt w:val="bullet"/>
+      <w:lvlText w:val="o"/>
+      <w:lvlJc w:val="left"/>
+      <w:pPr>
+        <w:ind w:left="3600" w:hanging="360"/>
+      </w:pPr>
+      <w:rPr>
+        <w:rFonts w:ascii="Courier New" w:hAnsi="Courier New" w:cs="Courier New" w:hint="default"/>
+      </w:rPr>
+    </w:lvl>
+    <w:lvl w:ilvl="5" w:tplc="04090005" w:tentative="1">
+      <w:start w:val="1"/>
+      <w:numFmt w:val="bullet"/>
+      <w:lvlText w:val=""/>
+      <w:lvlJc w:val="left"/>
+      <w:pPr>
+        <w:ind w:left="4320" w:hanging="360"/>
+      </w:pPr>
+      <w:rPr>
+        <w:rFonts w:ascii="Wingdings" w:hAnsi="Wingdings" w:hint="default"/>
+      </w:rPr>
+    </w:lvl>
+    <w:lvl w:ilvl="6" w:tplc="04090001" w:tentative="1">
+      <w:start w:val="1"/>
+      <w:numFmt w:val="bullet"/>
+      <w:lvlText w:val=""/>
+      <w:lvlJc w:val="left"/>
+      <w:pPr>
+        <w:ind w:left="5040" w:hanging="360"/>
+      </w:pPr>
+      <w:rPr>
+        <w:rFonts w:ascii="Symbol" w:hAnsi="Symbol" w:hint="default"/>
+      </w:rPr>
+    </w:lvl>
+    <w:lvl w:ilvl="7" w:tplc="04090003" w:tentative="1">
+      <w:start w:val="1"/>
+      <w:numFmt w:val="bullet"/>
+      <w:lvlText w:val="o"/>
+      <w:lvlJc w:val="left"/>
+      <w:pPr>
+        <w:ind w:left="5760" w:hanging="360"/>
+      </w:pPr>
+      <w:rPr>
+        <w:rFonts w:ascii="Courier New" w:hAnsi="Courier New" w:cs="Courier New" w:hint="default"/>
+      </w:rPr>
+    </w:lvl>
+    <w:lvl w:ilvl="8" w:tplc="04090005" w:tentative="1">
+      <w:start w:val="1"/>
+      <w:numFmt w:val="bullet"/>
+      <w:lvlText w:val=""/>
+      <w:lvlJc w:val="left"/>
+      <w:pPr>
+        <w:ind w:left="6480" w:hanging="360"/>
+      </w:pPr>
+      <w:rPr>
+        <w:rFonts w:ascii="Wingdings" w:hAnsi="Wingdings" w:hint="default"/>
+      </w:rPr>
+    </w:lvl>
+  </w:abstractNum>
+  <w:abstractNum w:abstractNumId="2" w15:restartNumberingAfterBreak="0">
+    <w:nsid w:val="6E160B2E"/>
+    <w:multiLevelType w:val="hybridMultilevel"/>
+    <w:tmpl w:val="C4E4E6EA"/>
+    <w:lvl w:ilvl="0" w:tplc="7FF8EF8E">
+      <w:numFmt w:val="bullet"/>
+      <w:lvlText w:val=""/>
+      <w:lvlJc w:val="left"/>
+      <w:pPr>
+        <w:ind w:left="720" w:hanging="360"/>
+      </w:pPr>
+      <w:rPr>
+        <w:rFonts w:ascii="Symbol" w:eastAsiaTheme="minorHAnsi" w:hAnsi="Symbol" w:cstheme="minorBidi" w:hint="default"/>
+      </w:rPr>
+    </w:lvl>
+    <w:lvl w:ilvl="1" w:tplc="04090003">
+      <w:start w:val="1"/>
+      <w:numFmt w:val="bullet"/>
+      <w:lvlText w:val="o"/>
+      <w:lvlJc w:val="left"/>
+      <w:pPr>
+        <w:ind w:left="1440" w:hanging="360"/>
+      </w:pPr>
+      <w:rPr>
+        <w:rFonts w:ascii="Courier New" w:hAnsi="Courier New" w:cs="Courier New" w:hint="default"/>
+      </w:rPr>
+    </w:lvl>
+    <w:lvl w:ilvl="2" w:tplc="04090005" w:tentative="1">
+      <w:start w:val="1"/>
+      <w:numFmt w:val="bullet"/>
+      <w:lvlText w:val=""/>
+      <w:lvlJc w:val="left"/>
+      <w:pPr>
+        <w:ind w:left="2160" w:hanging="360"/>
+      </w:pPr>
+      <w:rPr>
+        <w:rFonts w:ascii="Wingdings" w:hAnsi="Wingdings" w:hint="default"/>
+      </w:rPr>
+    </w:lvl>
+    <w:lvl w:ilvl="3" w:tplc="04090001" w:tentative="1">
+      <w:start w:val="1"/>
+      <w:numFmt w:val="bullet"/>
+      <w:lvlText w:val=""/>
+      <w:lvlJc w:val="left"/>
+      <w:pPr>
+        <w:ind w:left="2880" w:hanging="360"/>
+      </w:pPr>
+      <w:rPr>
+        <w:rFonts w:ascii="Symbol" w:hAnsi="Symbol" w:hint="default"/>
+      </w:rPr>
+    </w:lvl>
+    <w:lvl w:ilvl="4" w:tplc="04090003" w:tentative="1">
+      <w:start w:val="1"/>
+      <w:numFmt w:val="bullet"/>
+      <w:lvlText w:val="o"/>
+      <w:lvlJc w:val="left"/>
+      <w:pPr>
+        <w:ind w:left="3600" w:hanging="360"/>
+      </w:pPr>
+      <w:rPr>
+        <w:rFonts w:ascii="Courier New" w:hAnsi="Courier New" w:cs="Courier New" w:hint="default"/>
+      </w:rPr>
+    </w:lvl>
+    <w:lvl w:ilvl="5" w:tplc="04090005" w:tentative="1">
+      <w:start w:val="1"/>
+      <w:numFmt w:val="bullet"/>
+      <w:lvlText w:val=""/>
+      <w:lvlJc w:val="left"/>
+      <w:pPr>
+        <w:ind w:left="4320" w:hanging="360"/>
+      </w:pPr>
+      <w:rPr>
+        <w:rFonts w:ascii="Wingdings" w:hAnsi="Wingdings" w:hint="default"/>
+      </w:rPr>
+    </w:lvl>
+    <w:lvl w:ilvl="6" w:tplc="04090001" w:tentative="1">
+      <w:start w:val="1"/>
+      <w:numFmt w:val="bullet"/>
+      <w:lvlText w:val=""/>
+      <w:lvlJc w:val="left"/>
+      <w:pPr>
+        <w:ind w:left="5040" w:hanging="360"/>
+      </w:pPr>
+      <w:rPr>
+        <w:rFonts w:ascii="Symbol" w:hAnsi="Symbol" w:hint="default"/>
+      </w:rPr>
+    </w:lvl>
+    <w:lvl w:ilvl="7" w:tplc="04090003" w:tentative="1">
+      <w:start w:val="1"/>
+      <w:numFmt w:val="bullet"/>
+      <w:lvlText w:val="o"/>
+      <w:lvlJc w:val="left"/>
+      <w:pPr>
+        <w:ind w:left="5760" w:hanging="360"/>
+      </w:pPr>
+      <w:rPr>
+        <w:rFonts w:ascii="Courier New" w:hAnsi="Courier New" w:cs="Courier New" w:hint="default"/>
+      </w:rPr>
+    </w:lvl>
+    <w:lvl w:ilvl="8" w:tplc="04090005" w:tentative="1">
+      <w:start w:val="1"/>
+      <w:numFmt w:val="bullet"/>
+      <w:lvlText w:val=""/>
+      <w:lvlJc w:val="left"/>
+      <w:pPr>
+        <w:ind w:left="6480" w:hanging="360"/>
+      </w:pPr>
+      <w:rPr>
+        <w:rFonts w:ascii="Wingdings" w:hAnsi="Wingdings" w:hint="default"/>
+      </w:rPr>
+    </w:lvl>
+  </w:abstractNum>
   <w:num w:numId="1" w16cid:durableId="1515151299">
+    <w:abstractNumId w:val="1"/>
+  </w:num>
+  <w:num w:numId="2" w16cid:durableId="1998268437">
     <w:abstractNumId w:val="0"/>
+  </w:num>
+  <w:num w:numId="3" w16cid:durableId="2034457297">
+    <w:abstractNumId w:val="2"/>
   </w:num>
 </w:numbering>
 </file>
@@ -1668,6 +3687,50 @@
       <w:shd w:val="clear" w:color="auto" w:fill="E1DFDD"/>
     </w:rPr>
   </w:style>
+  <w:style w:type="paragraph" w:styleId="Header">
+    <w:name w:val="header"/>
+    <w:basedOn w:val="Normal"/>
+    <w:link w:val="HeaderChar"/>
+    <w:uiPriority w:val="99"/>
+    <w:unhideWhenUsed/>
+    <w:rsid w:val="00815CBC"/>
+    <w:pPr>
+      <w:tabs>
+        <w:tab w:val="center" w:pos="4680"/>
+        <w:tab w:val="right" w:pos="9360"/>
+      </w:tabs>
+      <w:spacing w:after="0" w:line="240" w:lineRule="auto"/>
+    </w:pPr>
+  </w:style>
+  <w:style w:type="character" w:customStyle="1" w:styleId="HeaderChar">
+    <w:name w:val="Header Char"/>
+    <w:basedOn w:val="DefaultParagraphFont"/>
+    <w:link w:val="Header"/>
+    <w:uiPriority w:val="99"/>
+    <w:rsid w:val="00815CBC"/>
+  </w:style>
+  <w:style w:type="paragraph" w:styleId="Footer">
+    <w:name w:val="footer"/>
+    <w:basedOn w:val="Normal"/>
+    <w:link w:val="FooterChar"/>
+    <w:uiPriority w:val="99"/>
+    <w:unhideWhenUsed/>
+    <w:rsid w:val="00815CBC"/>
+    <w:pPr>
+      <w:tabs>
+        <w:tab w:val="center" w:pos="4680"/>
+        <w:tab w:val="right" w:pos="9360"/>
+      </w:tabs>
+      <w:spacing w:after="0" w:line="240" w:lineRule="auto"/>
+    </w:pPr>
+  </w:style>
+  <w:style w:type="character" w:customStyle="1" w:styleId="FooterChar">
+    <w:name w:val="Footer Char"/>
+    <w:basedOn w:val="DefaultParagraphFont"/>
+    <w:link w:val="Footer"/>
+    <w:uiPriority w:val="99"/>
+    <w:rsid w:val="00815CBC"/>
+  </w:style>
 </w:styles>
 </file>
 

</xml_diff>